<commit_message>
updated zvit for diplomm
</commit_message>
<xml_diff>
--- a/Звіт/Диплом/практика2026.docx
+++ b/Звіт/Диплом/практика2026.docx
@@ -2321,7 +2321,6 @@
                               <w:spacing w:before="238" w:after="198"/>
                               <w:rPr>
                                 <w:szCs w:val="28"/>
-                                <w:lang w:val="uk-UA"/>
                               </w:rPr>
                             </w:pPr>
                             <w:r>
@@ -2362,7 +2361,6 @@
                         <w:spacing w:before="238" w:after="198"/>
                         <w:rPr>
                           <w:szCs w:val="28"/>
-                          <w:lang w:val="uk-UA"/>
                         </w:rPr>
                       </w:pPr>
                       <w:r>
@@ -2499,10 +2497,9 @@
                         <w:txbxContent>
                           <w:p>
                             <w:pPr>
-                              <w:spacing w:before="238" w:after="198" w:line="360" w:lineRule="auto"/>
+                              <w:spacing w:before="238" w:after="198"/>
                               <w:rPr>
                                 <w:szCs w:val="28"/>
-                                <w:lang w:val="uk-UA"/>
                               </w:rPr>
                             </w:pPr>
                             <w:r>
@@ -2534,14 +2531,12 @@
                             <w:r>
                               <w:rPr>
                                 <w:szCs w:val="28"/>
-                                <w:lang w:val="uk-UA"/>
                               </w:rPr>
                               <w:t>ійні методи оптимізації</w:t>
                             </w:r>
                             <w:r>
                               <w:rPr>
                                 <w:szCs w:val="28"/>
-                                <w:lang w:val="uk-UA"/>
                               </w:rPr>
                               <w:t>, інструментарій розробки</w:t>
                             </w:r>
@@ -2570,10 +2565,9 @@
                   <w:txbxContent>
                     <w:p>
                       <w:pPr>
-                        <w:spacing w:before="238" w:after="198" w:line="360" w:lineRule="auto"/>
+                        <w:spacing w:before="238" w:after="198"/>
                         <w:rPr>
                           <w:szCs w:val="28"/>
-                          <w:lang w:val="uk-UA"/>
                         </w:rPr>
                       </w:pPr>
                       <w:r>
@@ -2605,14 +2599,12 @@
                       <w:r>
                         <w:rPr>
                           <w:szCs w:val="28"/>
-                          <w:lang w:val="uk-UA"/>
                         </w:rPr>
                         <w:t>ійні методи оптимізації</w:t>
                       </w:r>
                       <w:r>
                         <w:rPr>
                           <w:szCs w:val="28"/>
-                          <w:lang w:val="uk-UA"/>
                         </w:rPr>
                         <w:t>, інструментарій розробки</w:t>
                       </w:r>
@@ -2729,18 +2721,23 @@
                         <w:txbxContent>
                           <w:p>
                             <w:pPr>
-                              <w:spacing w:before="238" w:after="198" w:line="360" w:lineRule="auto"/>
+                              <w:spacing w:before="238" w:after="198"/>
                               <w:rPr>
                                 <w:szCs w:val="28"/>
-                                <w:lang w:val="uk-UA"/>
                               </w:rPr>
                             </w:pPr>
                             <w:r>
                               <w:rPr>
                                 <w:szCs w:val="28"/>
-                                <w:lang w:val="uk-UA"/>
                               </w:rPr>
                               <w:t>Картографічні дані</w:t>
+                            </w:r>
+                            <w:r>
+                              <w:rPr>
+                                <w:szCs w:val="28"/>
+                                <w:lang w:val="ru-UA"/>
+                              </w:rPr>
+                              <w:t>, наукова література, параметри логістичної системи</w:t>
                             </w:r>
                             <w:r>
                               <w:rPr>
@@ -2752,35 +2749,6 @@
                             <w:r>
                               <w:rPr>
                                 <w:szCs w:val="28"/>
-                                <w:lang w:val="ru-UA"/>
-                              </w:rPr>
-                              <w:t>наукова література</w:t>
-                            </w:r>
-                            <w:r>
-                              <w:rPr>
-                                <w:szCs w:val="28"/>
-                                <w:lang w:val="ru-UA"/>
-                              </w:rPr>
-                              <w:t xml:space="preserve">, </w:t>
-                            </w:r>
-                            <w:r>
-                              <w:rPr>
-                                <w:szCs w:val="28"/>
-                                <w:lang w:val="ru-UA"/>
-                              </w:rPr>
-                              <w:t>параметри логістичної системи</w:t>
-                            </w:r>
-                            <w:r>
-                              <w:rPr>
-                                <w:szCs w:val="28"/>
-                                <w:lang w:val="ru-UA"/>
-                              </w:rPr>
-                              <w:t xml:space="preserve">, </w:t>
-                            </w:r>
-                            <w:r>
-                              <w:rPr>
-                                <w:szCs w:val="28"/>
-                                <w:lang w:val="uk-UA"/>
                               </w:rPr>
                               <w:t>тестові набори даних</w:t>
                             </w:r>
@@ -2809,18 +2777,23 @@
                   <w:txbxContent>
                     <w:p>
                       <w:pPr>
-                        <w:spacing w:before="238" w:after="198" w:line="360" w:lineRule="auto"/>
+                        <w:spacing w:before="238" w:after="198"/>
                         <w:rPr>
                           <w:szCs w:val="28"/>
-                          <w:lang w:val="uk-UA"/>
                         </w:rPr>
                       </w:pPr>
                       <w:r>
                         <w:rPr>
                           <w:szCs w:val="28"/>
-                          <w:lang w:val="uk-UA"/>
                         </w:rPr>
                         <w:t>Картографічні дані</w:t>
+                      </w:r>
+                      <w:r>
+                        <w:rPr>
+                          <w:szCs w:val="28"/>
+                          <w:lang w:val="ru-UA"/>
+                        </w:rPr>
+                        <w:t>, наукова література, параметри логістичної системи</w:t>
                       </w:r>
                       <w:r>
                         <w:rPr>
@@ -2832,35 +2805,6 @@
                       <w:r>
                         <w:rPr>
                           <w:szCs w:val="28"/>
-                          <w:lang w:val="ru-UA"/>
-                        </w:rPr>
-                        <w:t>наукова література</w:t>
-                      </w:r>
-                      <w:r>
-                        <w:rPr>
-                          <w:szCs w:val="28"/>
-                          <w:lang w:val="ru-UA"/>
-                        </w:rPr>
-                        <w:t xml:space="preserve">, </w:t>
-                      </w:r>
-                      <w:r>
-                        <w:rPr>
-                          <w:szCs w:val="28"/>
-                          <w:lang w:val="ru-UA"/>
-                        </w:rPr>
-                        <w:t>параметри логістичної системи</w:t>
-                      </w:r>
-                      <w:r>
-                        <w:rPr>
-                          <w:szCs w:val="28"/>
-                          <w:lang w:val="ru-UA"/>
-                        </w:rPr>
-                        <w:t xml:space="preserve">, </w:t>
-                      </w:r>
-                      <w:r>
-                        <w:rPr>
-                          <w:szCs w:val="28"/>
-                          <w:lang w:val="uk-UA"/>
                         </w:rPr>
                         <w:t>тестові набори даних</w:t>
                       </w:r>
@@ -3224,6 +3168,7 @@
         <w:rPr>
           <w:rFonts w:cs="Times New Roman"/>
           <w:szCs w:val="28"/>
+          <w:lang w:val="ru-RU"/>
         </w:rPr>
         <w:fldChar w:fldCharType="begin"/>
       </w:r>
@@ -3238,6 +3183,7 @@
         <w:rPr>
           <w:rFonts w:cs="Times New Roman"/>
           <w:szCs w:val="28"/>
+          <w:lang w:val="ru-RU"/>
         </w:rPr>
         <w:fldChar w:fldCharType="separate"/>
       </w:r>
@@ -4585,11 +4531,8 @@
         <w:pStyle w:val="NormalText"/>
       </w:pPr>
       <w:r>
-        <w:t xml:space="preserve">Сучасний стан розвитку глобальної економіки та стрімка цифровізація </w:t>
-      </w:r>
-      <w:r>
         <w:lastRenderedPageBreak/>
-        <w:t>торговельних процесів зумовлюють зростання вимог до ефективності логістичних систем. Предметна область даної роботи охоплює процеси планування, управління та оптимізації доставки вантажів у складних міських умовах. Ключовим аспектом є забезпечення своєчасного розподілу товарів між пунктами призначення при мінімізації витрат на експлуатацію транспортного парку.</w:t>
+        <w:t>Сучасний стан розвитку глобальної економіки та стрімка цифровізація торговельних процесів зумовлюють зростання вимог до ефективності логістичних систем. Предметна область даної роботи охоплює процеси планування, управління та оптимізації доставки вантажів у складних міських умовах. Ключовим аспектом є забезпечення своєчасного розподілу товарів між пунктами призначення при мінімізації витрат на експлуатацію транспортного парку.</w:t>
       </w:r>
     </w:p>
     <w:p>
@@ -4769,33 +4712,11 @@
       <w:r>
         <w:t>де V – н</w:t>
       </w:r>
-      <w:proofErr w:type="spellStart"/>
-      <w:r>
-        <w:rPr>
-          <w:lang w:val="en-US"/>
-        </w:rPr>
-        <w:t>оди</w:t>
-      </w:r>
-      <w:proofErr w:type="spellEnd"/>
-      <w:r>
-        <w:rPr>
-          <w:lang w:val="en-US"/>
-        </w:rPr>
-        <w:t xml:space="preserve"> </w:t>
-      </w:r>
-      <w:proofErr w:type="spellStart"/>
-      <w:r>
-        <w:rPr>
-          <w:lang w:val="en-US"/>
-        </w:rPr>
-        <w:t>графа</w:t>
-      </w:r>
-      <w:proofErr w:type="spellEnd"/>
-      <w:r>
-        <w:rPr>
-          <w:lang w:val="en-US"/>
-        </w:rPr>
-        <w:t>;</w:t>
+      <w:r>
+        <w:rPr>
+          <w:lang w:val="en-US"/>
+        </w:rPr>
+        <w:t>оди графа;</w:t>
       </w:r>
     </w:p>
     <w:p>
@@ -4816,16 +4737,8 @@
         <w:rPr>
           <w:lang w:val="en-US"/>
         </w:rPr>
-        <w:t xml:space="preserve"> </w:t>
-      </w:r>
-      <w:proofErr w:type="spellStart"/>
-      <w:r>
-        <w:rPr>
-          <w:lang w:val="en-US"/>
-        </w:rPr>
-        <w:t>графа</w:t>
-      </w:r>
-      <w:proofErr w:type="spellEnd"/>
+        <w:t xml:space="preserve"> графа</w:t>
+      </w:r>
       <w:r>
         <w:t>.</w:t>
       </w:r>
@@ -4849,11 +4762,11 @@
         <w:pStyle w:val="NormalText"/>
       </w:pPr>
       <w:r>
-        <w:t xml:space="preserve">Функціональні особливості об’єкта полягають у динамічній взаємодії різних типів транспортних засобів (автомобілів, велосипедів, кур'єрів-пішоходів) для виконання завдань доставки. Кожна одиниця транспорту має обмежену вантажну місткість, а кожен маршрут повинен бути завершений у межах визначеного часового вікна хабу. Особливе значення має функція «останньої милі», яка передбачає можливість долання частини шляху пішки, якщо прямий </w:t>
+        <w:t xml:space="preserve">Функціональні особливості об’єкта полягають у динамічній взаємодії різних типів транспортних засобів (автомобілів, велосипедів, кур'єрів-пішоходів) для виконання завдань доставки. Кожна одиниця транспорту має обмежену вантажну місткість, а кожен маршрут повинен бути завершений у межах визначеного часового вікна хабу. Особливе значення має функція «останньої </w:t>
       </w:r>
       <w:r>
         <w:lastRenderedPageBreak/>
-        <w:t>доступ транспорту до точки призначення обмежений або неможливий.</w:t>
+        <w:t>милі», яка передбачає можливість долання частини шляху пішки, якщо прямий доступ транспорту до точки призначення обмежений або неможливий.</w:t>
       </w:r>
     </w:p>
     <w:p>
@@ -4990,11 +4903,11 @@
         <w:pStyle w:val="NormalText"/>
       </w:pPr>
       <w:r>
-        <w:t xml:space="preserve">Сучасні дослідження значно розширили можливості моделювання реальної інфраструктури. У фундаментальній монографії Паоло Тота та Даніеле Віго «The Vehicle Routing Problem» проведено системний аналіз точних та </w:t>
+        <w:t xml:space="preserve">Сучасні дослідження значно розширили можливості моделювання реальної інфраструктури. У фундаментальній монографії Паоло Тота та Даніеле </w:t>
       </w:r>
       <w:r>
         <w:lastRenderedPageBreak/>
-        <w:t>наближених методів розв’язання VRP</w:t>
+        <w:t>Віго «The Vehicle Routing Problem» проведено системний аналіз точних та наближених методів розв’язання VRP</w:t>
       </w:r>
       <w:r>
         <w:t>[3]</w:t>
@@ -5097,6 +5010,7 @@
         <w:pStyle w:val="NormalText"/>
       </w:pPr>
       <w:r>
+        <w:lastRenderedPageBreak/>
         <w:t>Ц</w:t>
       </w:r>
       <w:r>
@@ -5112,11 +5026,7 @@
         <w:t>2</w:t>
       </w:r>
       <w:r>
-        <w:t xml:space="preserve">). Мінімізація сумарних витрат, що складаються з часу </w:t>
-      </w:r>
-      <w:r>
-        <w:lastRenderedPageBreak/>
-        <w:t>переїздів та кількості задіяних транспортних засобів.</w:t>
+        <w:t>). Мінімізація сумарних витрат, що складаються з часу переїздів та кількості задіяних транспортних засобів.</w:t>
       </w:r>
     </w:p>
     <w:p>
@@ -5896,11 +5806,11 @@
         <w:pStyle w:val="NormalText"/>
       </w:pPr>
       <w:r>
-        <w:t xml:space="preserve">У результаті аналізу предметної області встановлено, що задача маршрутизації (VRP) у сучасних мультимодальних мережах є NP-складною, що унеможливлює використання виключно точних методів для реальних масштабів інфраструктури. Огляд літератури та існуючих підходів підтвердив, що класичні конструктивні евристики часто застрягають у локальних оптимумах, тому виникає гостра потреба у використанні метаевристичних методів. Доведено актуальність розробки алгоритмічного забезпечення на основі генетичних алгоритмів, які здатні ефективно знаходити наближені до глобального оптимуму </w:t>
+        <w:t xml:space="preserve">У результаті аналізу предметної області встановлено, що задача маршрутизації (VRP) у сучасних мультимодальних мережах є NP-складною, що унеможливлює використання виключно точних методів для реальних масштабів інфраструктури. Огляд літератури та існуючих підходів підтвердив, що класичні конструктивні евристики часто застрягають у локальних оптимумах, тому виникає гостра потреба у використанні метаевристичних методів. Доведено актуальність розробки алгоритмічного забезпечення на основі генетичних </w:t>
       </w:r>
       <w:r>
         <w:lastRenderedPageBreak/>
-        <w:t>розв'язки з урахуванням жорстких часових вікон та специфіки «останньої милі». Сформована теоретична база та математична модель об'єкта стають фундаментом для подальшої програмної реалізації інтелектуальної системи логістики.</w:t>
+        <w:t>алгоритмів, які здатні ефективно знаходити наближені до глобального оптимуму розв'язки з урахуванням жорстких часових вікон та специфіки «останньої милі». Сформована теоретична база та математична модель об'єкта стають фундаментом для подальшої програмної реалізації інтелектуальної системи логістики.</w:t>
       </w:r>
     </w:p>
     <w:p>
@@ -5962,7 +5872,6 @@
         </w:rPr>
         <w:t xml:space="preserve">Декомпозиція системи виконана за допомогою CASE-засобу </w:t>
       </w:r>
-      <w:proofErr w:type="spellStart"/>
       <w:r>
         <w:rPr>
           <w:color w:val="000000"/>
@@ -5970,7 +5879,6 @@
         </w:rPr>
         <w:t>PlantUML</w:t>
       </w:r>
-      <w:proofErr w:type="spellEnd"/>
       <w:r>
         <w:rPr>
           <w:color w:val="000000"/>
@@ -6626,7 +6534,7 @@
         </w:rPr>
         <w:lastRenderedPageBreak/>
         <w:drawing>
-          <wp:inline distT="0" distB="0" distL="0" distR="0" wp14:anchorId="4D81B15D" wp14:editId="0CAFCA83">
+          <wp:inline distT="0" distB="0" distL="0" distR="0" wp14:anchorId="4D81B15D" wp14:editId="12908CCE">
             <wp:extent cx="6120130" cy="4850765"/>
             <wp:effectExtent l="0" t="0" r="0" b="6985"/>
             <wp:docPr id="6" name="Picture 6" descr="A black screen with white lines and blue rectangles&#10;&#10;AI-generated content may be incorrect."/>
@@ -6671,9 +6579,6 @@
     <w:p>
       <w:pPr>
         <w:pStyle w:val="NormalText"/>
-        <w:rPr>
-          <w:lang w:val="en-US"/>
-        </w:rPr>
       </w:pPr>
       <w:r>
         <w:t xml:space="preserve">Рисунок 2.3 – </w:t>
@@ -6688,17 +6593,11 @@
     <w:p>
       <w:pPr>
         <w:pStyle w:val="NormalText"/>
-        <w:rPr>
-          <w:lang w:val="en-US"/>
-        </w:rPr>
-      </w:pPr>
-    </w:p>
-    <w:p>
-      <w:pPr>
-        <w:pStyle w:val="NormalText"/>
-        <w:rPr>
-          <w:lang w:val="en-US"/>
-        </w:rPr>
+      </w:pPr>
+    </w:p>
+    <w:p>
+      <w:pPr>
+        <w:pStyle w:val="NormalText"/>
       </w:pPr>
     </w:p>
     <w:p>
@@ -7868,6 +7767,3198 @@
     </w:p>
     <w:p>
       <w:pPr>
+        <w:spacing w:before="0" w:after="0"/>
+        <w:rPr>
+          <w:rFonts w:eastAsia="Times New Roman" w:cs="Times New Roman"/>
+          <w:kern w:val="0"/>
+        </w:rPr>
+      </w:pPr>
+      <w:r>
+        <w:br w:type="page"/>
+      </w:r>
+    </w:p>
+    <w:p>
+      <w:pPr>
+        <w:pStyle w:val="Heading1"/>
+      </w:pPr>
+      <w:r>
+        <w:lastRenderedPageBreak/>
+        <w:t>3 РОЗРАХУНКОВИЙ РОЗДІЛ</w:t>
+      </w:r>
+    </w:p>
+    <w:p>
+      <w:pPr>
+        <w:pStyle w:val="Heading2"/>
+        <w:rPr>
+          <w:lang w:val="ru-UA"/>
+        </w:rPr>
+      </w:pPr>
+      <w:r>
+        <w:t xml:space="preserve">3.1 </w:t>
+      </w:r>
+      <w:r>
+        <w:rPr>
+          <w:lang w:val="ru-UA"/>
+        </w:rPr>
+        <w:t>Програмне забезпечення</w:t>
+      </w:r>
+    </w:p>
+    <w:p>
+      <w:pPr>
+        <w:pStyle w:val="Standard"/>
+        <w:spacing w:line="360" w:lineRule="auto"/>
+        <w:rPr>
+          <w:sz w:val="28"/>
+          <w:szCs w:val="28"/>
+          <w:lang w:val="en-US"/>
+        </w:rPr>
+      </w:pPr>
+    </w:p>
+    <w:p>
+      <w:pPr>
+        <w:pStyle w:val="Standard"/>
+        <w:spacing w:line="360" w:lineRule="auto"/>
+        <w:rPr>
+          <w:sz w:val="28"/>
+          <w:szCs w:val="28"/>
+          <w:lang w:val="en-US"/>
+        </w:rPr>
+      </w:pPr>
+    </w:p>
+    <w:p>
+      <w:pPr>
+        <w:ind w:firstLine="709"/>
+      </w:pPr>
+      <w:r>
+        <w:rPr>
+          <w:lang w:val="ru-RU"/>
+        </w:rPr>
+        <w:t xml:space="preserve">Розроблена інформаційна система оптимізації маршрутів доставки реалізована як веб-застосунок із серверною логікою. </w:t>
+      </w:r>
+      <w:r>
+        <w:rPr>
+          <w:lang w:val="en-US"/>
+        </w:rPr>
+        <w:t>Вибір програмного забезпечення обумовлений вимогами до швидкості розробки, наявності зрілих бібліотек для роботи з географічними даними та можливості створення інтерактивного інтерфейсу без залучення окремої фронтенд-команди.</w:t>
+      </w:r>
+    </w:p>
+    <w:p>
+      <w:pPr>
+        <w:ind w:firstLine="709"/>
+        <w:rPr>
+          <w:lang w:val="ru-RU"/>
+        </w:rPr>
+      </w:pPr>
+      <w:r>
+        <w:rPr>
+          <w:lang w:val="ru-RU"/>
+        </w:rPr>
+        <w:t xml:space="preserve">Як основну мову програмування обрано </w:t>
+      </w:r>
+      <w:r>
+        <w:rPr>
+          <w:lang w:val="en-US"/>
+        </w:rPr>
+        <w:t>Python</w:t>
+      </w:r>
+      <w:r>
+        <w:rPr>
+          <w:lang w:val="ru-RU"/>
+        </w:rPr>
+        <w:t>. Цей вибір зумовлений наступними чинниками:</w:t>
+      </w:r>
+    </w:p>
+    <w:p>
+      <w:pPr>
+        <w:ind w:firstLine="709"/>
+        <w:rPr>
+          <w:lang w:val="ru-RU"/>
+        </w:rPr>
+      </w:pPr>
+      <w:r>
+        <w:rPr>
+          <w:lang w:val="ru-RU"/>
+        </w:rPr>
+        <w:t>–</w:t>
+      </w:r>
+      <w:r>
+        <w:rPr>
+          <w:lang w:val="ru-RU"/>
+        </w:rPr>
+        <w:t> </w:t>
+      </w:r>
+      <w:r>
+        <w:rPr>
+          <w:lang w:val="ru-RU"/>
+        </w:rPr>
+        <w:t>розвинена екосистема бібліотек для роботи з графами (</w:t>
+      </w:r>
+      <w:r>
+        <w:rPr>
+          <w:lang w:val="en-US"/>
+        </w:rPr>
+        <w:t>NetworkX</w:t>
+      </w:r>
+      <w:r>
+        <w:rPr>
+          <w:lang w:val="ru-RU"/>
+        </w:rPr>
+        <w:t>), геоданими (</w:t>
+      </w:r>
+      <w:r>
+        <w:rPr>
+          <w:lang w:val="en-US"/>
+        </w:rPr>
+        <w:t>OSMnx</w:t>
+      </w:r>
+      <w:r>
+        <w:rPr>
+          <w:lang w:val="ru-RU"/>
+        </w:rPr>
+        <w:t xml:space="preserve">, </w:t>
+      </w:r>
+      <w:r>
+        <w:rPr>
+          <w:lang w:val="en-US"/>
+        </w:rPr>
+        <w:t>GeoPy</w:t>
+      </w:r>
+      <w:r>
+        <w:rPr>
+          <w:lang w:val="ru-RU"/>
+        </w:rPr>
+        <w:t>) та чисельних обчислень (</w:t>
+      </w:r>
+      <w:r>
+        <w:rPr>
+          <w:lang w:val="en-US"/>
+        </w:rPr>
+        <w:t>NumPy</w:t>
+      </w:r>
+      <w:r>
+        <w:rPr>
+          <w:lang w:val="ru-RU"/>
+        </w:rPr>
+        <w:t>);</w:t>
+      </w:r>
+    </w:p>
+    <w:p>
+      <w:pPr>
+        <w:ind w:firstLine="709"/>
+        <w:rPr>
+          <w:lang w:val="ru-RU"/>
+        </w:rPr>
+      </w:pPr>
+      <w:r>
+        <w:rPr>
+          <w:lang w:val="ru-RU"/>
+        </w:rPr>
+        <w:t>–</w:t>
+      </w:r>
+      <w:r>
+        <w:rPr>
+          <w:lang w:val="ru-RU"/>
+        </w:rPr>
+        <w:t> </w:t>
+      </w:r>
+      <w:r>
+        <w:rPr>
+          <w:lang w:val="ru-RU"/>
+        </w:rPr>
+        <w:t>підтримка об’єктно-орієнтованої парадигми, що відповідає декомпозиції системи на класи</w:t>
+      </w:r>
+      <w:r>
+        <w:rPr>
+          <w:lang w:val="ru-RU"/>
+        </w:rPr>
+        <w:t>;</w:t>
+      </w:r>
+    </w:p>
+    <w:p>
+      <w:pPr>
+        <w:ind w:firstLine="709"/>
+        <w:rPr>
+          <w:lang w:val="ru-RU"/>
+        </w:rPr>
+      </w:pPr>
+      <w:r>
+        <w:rPr>
+          <w:lang w:val="ru-RU"/>
+        </w:rPr>
+        <w:t>–</w:t>
+      </w:r>
+      <w:r>
+        <w:rPr>
+          <w:lang w:val="ru-RU"/>
+        </w:rPr>
+        <w:t> </w:t>
+      </w:r>
+      <w:r>
+        <w:rPr>
+          <w:lang w:val="ru-RU"/>
+        </w:rPr>
+        <w:t>висока продуктивність розробника завдяки динамічній типізації та лаконічному синтаксису;</w:t>
+      </w:r>
+    </w:p>
+    <w:p>
+      <w:pPr>
+        <w:ind w:firstLine="709"/>
+        <w:rPr>
+          <w:lang w:val="ru-RU"/>
+        </w:rPr>
+      </w:pPr>
+      <w:r>
+        <w:rPr>
+          <w:lang w:val="ru-RU"/>
+        </w:rPr>
+        <w:t>–</w:t>
+      </w:r>
+      <w:r>
+        <w:rPr>
+          <w:lang w:val="ru-RU"/>
+        </w:rPr>
+        <w:t> </w:t>
+      </w:r>
+      <w:r>
+        <w:rPr>
+          <w:lang w:val="ru-RU"/>
+        </w:rPr>
+        <w:t xml:space="preserve">кросплатформність </w:t>
+      </w:r>
+      <w:r>
+        <w:rPr>
+          <w:lang w:val="ru-RU"/>
+        </w:rPr>
+        <w:t>–</w:t>
+      </w:r>
+      <w:r>
+        <w:rPr>
+          <w:lang w:val="ru-RU"/>
+        </w:rPr>
+        <w:t xml:space="preserve"> </w:t>
+      </w:r>
+      <w:r>
+        <w:rPr>
+          <w:lang w:val="ru-RU"/>
+        </w:rPr>
+        <w:t xml:space="preserve">застосунок працює у </w:t>
+      </w:r>
+      <w:r>
+        <w:rPr>
+          <w:lang w:val="en-US"/>
+        </w:rPr>
+        <w:t>Windows</w:t>
+      </w:r>
+      <w:r>
+        <w:rPr>
+          <w:lang w:val="ru-RU"/>
+        </w:rPr>
+        <w:t xml:space="preserve"> та в </w:t>
+      </w:r>
+      <w:r>
+        <w:rPr>
+          <w:lang w:val="en-US"/>
+        </w:rPr>
+        <w:t>Unix</w:t>
+      </w:r>
+      <w:r>
+        <w:rPr>
+          <w:lang w:val="ru-RU"/>
+        </w:rPr>
+        <w:t>-подібних системах без модифікації коду.</w:t>
+      </w:r>
+    </w:p>
+    <w:p>
+      <w:pPr>
+        <w:ind w:firstLine="709"/>
+        <w:rPr>
+          <w:lang w:val="en-US"/>
+        </w:rPr>
+      </w:pPr>
+      <w:r>
+        <w:rPr>
+          <w:lang w:val="ru-RU"/>
+        </w:rPr>
+        <w:t xml:space="preserve">Інтегрованим середовищем розробки обрано </w:t>
+      </w:r>
+      <w:r>
+        <w:rPr>
+          <w:lang w:val="en-US"/>
+        </w:rPr>
+        <w:t>Visual</w:t>
+      </w:r>
+      <w:r>
+        <w:rPr>
+          <w:lang w:val="ru-RU"/>
+        </w:rPr>
+        <w:t xml:space="preserve"> </w:t>
+      </w:r>
+      <w:r>
+        <w:rPr>
+          <w:lang w:val="en-US"/>
+        </w:rPr>
+        <w:t>Studio</w:t>
+      </w:r>
+      <w:r>
+        <w:rPr>
+          <w:lang w:val="ru-RU"/>
+        </w:rPr>
+        <w:t xml:space="preserve"> </w:t>
+      </w:r>
+      <w:r>
+        <w:rPr>
+          <w:lang w:val="en-US"/>
+        </w:rPr>
+        <w:t>Code</w:t>
+      </w:r>
+      <w:r>
+        <w:rPr>
+          <w:lang w:val="ru-RU"/>
+        </w:rPr>
+        <w:t xml:space="preserve"> з розширеннями </w:t>
+      </w:r>
+      <w:r>
+        <w:rPr>
+          <w:lang w:val="en-US"/>
+        </w:rPr>
+        <w:t>Python</w:t>
+      </w:r>
+      <w:r>
+        <w:rPr>
+          <w:lang w:val="ru-RU"/>
+        </w:rPr>
+        <w:t xml:space="preserve">, </w:t>
+      </w:r>
+      <w:r>
+        <w:rPr>
+          <w:lang w:val="en-US"/>
+        </w:rPr>
+        <w:t>Pylance</w:t>
+      </w:r>
+      <w:r>
+        <w:rPr>
+          <w:lang w:val="ru-RU"/>
+        </w:rPr>
+        <w:t xml:space="preserve"> та </w:t>
+      </w:r>
+      <w:r>
+        <w:rPr>
+          <w:lang w:val="en-US"/>
+        </w:rPr>
+        <w:t>GitLens</w:t>
+      </w:r>
+      <w:r>
+        <w:rPr>
+          <w:lang w:val="ru-RU"/>
+        </w:rPr>
+        <w:t xml:space="preserve">. Контроль версій здійснювався за допомогою системи </w:t>
+      </w:r>
+      <w:r>
+        <w:rPr>
+          <w:lang w:val="en-US"/>
+        </w:rPr>
+        <w:t>Git</w:t>
+      </w:r>
+      <w:r>
+        <w:rPr>
+          <w:lang w:val="ru-RU"/>
+        </w:rPr>
+        <w:t xml:space="preserve"> з локальним репозиторієм.</w:t>
+      </w:r>
+    </w:p>
+    <w:p>
+      <w:pPr>
+        <w:ind w:firstLine="709"/>
+        <w:rPr>
+          <w:lang w:val="ru-RU"/>
+        </w:rPr>
+      </w:pPr>
+    </w:p>
+    <w:p>
+      <w:pPr>
+        <w:ind w:firstLine="709"/>
+        <w:rPr>
+          <w:lang w:val="ru-RU"/>
+        </w:rPr>
+      </w:pPr>
+    </w:p>
+    <w:p>
+      <w:pPr>
+        <w:pStyle w:val="Heading2"/>
+      </w:pPr>
+      <w:r>
+        <w:rPr>
+          <w:lang w:val="en-US"/>
+        </w:rPr>
+        <w:t>3.</w:t>
+      </w:r>
+      <w:r>
+        <w:t>2</w:t>
+      </w:r>
+      <w:r>
+        <w:rPr>
+          <w:lang w:val="en-US"/>
+        </w:rPr>
+        <w:t xml:space="preserve"> </w:t>
+      </w:r>
+      <w:r>
+        <w:t>Технічне</w:t>
+      </w:r>
+      <w:r>
+        <w:t xml:space="preserve"> забезпечення</w:t>
+      </w:r>
+    </w:p>
+    <w:p>
+      <w:pPr>
+        <w:ind w:firstLine="709"/>
+      </w:pPr>
+    </w:p>
+    <w:p>
+      <w:pPr>
+        <w:ind w:firstLine="709"/>
+      </w:pPr>
+    </w:p>
+    <w:p>
+      <w:pPr>
+        <w:ind w:firstLine="709"/>
+        <w:rPr>
+          <w:lang w:val="ru-RU"/>
+        </w:rPr>
+      </w:pPr>
+      <w:r>
+        <w:rPr>
+          <w:lang w:val="ru-RU"/>
+        </w:rPr>
+        <w:t>Для коректної роботи системи на стороні сервера встановлено наступні мінімальні вимоги до апаратного забезпечення:</w:t>
+      </w:r>
+    </w:p>
+    <w:p>
+      <w:pPr>
+        <w:ind w:firstLine="709"/>
+        <w:rPr>
+          <w:lang w:val="ru-RU"/>
+        </w:rPr>
+      </w:pPr>
+      <w:r>
+        <w:rPr>
+          <w:lang w:val="ru-RU"/>
+        </w:rPr>
+        <w:t>– </w:t>
+      </w:r>
+      <w:r>
+        <w:rPr>
+          <w:lang w:val="ru-RU"/>
+        </w:rPr>
+        <w:t xml:space="preserve">Процесор: не нижче рівня </w:t>
+      </w:r>
+      <w:r>
+        <w:rPr>
+          <w:lang w:val="en-US"/>
+        </w:rPr>
+        <w:t>Intel</w:t>
+      </w:r>
+      <w:r>
+        <w:rPr>
+          <w:lang w:val="ru-RU"/>
+        </w:rPr>
+        <w:t xml:space="preserve"> </w:t>
+      </w:r>
+      <w:r>
+        <w:rPr>
+          <w:lang w:val="en-US"/>
+        </w:rPr>
+        <w:t>Core</w:t>
+      </w:r>
+      <w:r>
+        <w:rPr>
+          <w:lang w:val="ru-RU"/>
+        </w:rPr>
+        <w:t xml:space="preserve"> </w:t>
+      </w:r>
+      <w:r>
+        <w:rPr>
+          <w:lang w:val="en-US"/>
+        </w:rPr>
+        <w:t>i</w:t>
+      </w:r>
+      <w:r>
+        <w:rPr>
+          <w:lang w:val="ru-RU"/>
+        </w:rPr>
+        <w:t>5 або еквівалентний. Обчислювальна складність генетичного алгоритму вимагає достатньої продуктивності одного потоку;</w:t>
+      </w:r>
+    </w:p>
+    <w:p>
+      <w:pPr>
+        <w:ind w:firstLine="709"/>
+        <w:rPr>
+          <w:lang w:val="ru-RU"/>
+        </w:rPr>
+      </w:pPr>
+      <w:r>
+        <w:rPr>
+          <w:lang w:val="ru-RU"/>
+        </w:rPr>
+        <w:t>–</w:t>
+      </w:r>
+      <w:r>
+        <w:rPr>
+          <w:lang w:val="ru-RU"/>
+        </w:rPr>
+        <w:t> </w:t>
+      </w:r>
+      <w:r>
+        <w:rPr>
+          <w:lang w:val="ru-RU"/>
+        </w:rPr>
+        <w:t xml:space="preserve">Оперативна пам’ять: не менше 8 ГБ. Граф дорожньої мережі міста середнього розміру (наприклад, м. Дніпро) у форматі </w:t>
+      </w:r>
+      <w:r>
+        <w:rPr>
+          <w:lang w:val="en-US"/>
+        </w:rPr>
+        <w:t>NetworkX</w:t>
+      </w:r>
+      <w:r>
+        <w:rPr>
+          <w:lang w:val="ru-RU"/>
+        </w:rPr>
+        <w:t xml:space="preserve"> </w:t>
+      </w:r>
+      <w:r>
+        <w:rPr>
+          <w:lang w:val="en-US"/>
+        </w:rPr>
+        <w:t>MultiDiGraph</w:t>
+      </w:r>
+      <w:r>
+        <w:rPr>
+          <w:lang w:val="ru-RU"/>
+        </w:rPr>
+        <w:t xml:space="preserve"> займає 400–800 МБ під час обробки;</w:t>
+      </w:r>
+    </w:p>
+    <w:p>
+      <w:pPr>
+        <w:ind w:firstLine="709"/>
+        <w:rPr>
+          <w:lang w:val="ru-RU"/>
+        </w:rPr>
+      </w:pPr>
+      <w:r>
+        <w:rPr>
+          <w:lang w:val="ru-RU"/>
+        </w:rPr>
+        <w:t>–</w:t>
+      </w:r>
+      <w:r>
+        <w:rPr>
+          <w:lang w:val="ru-RU"/>
+        </w:rPr>
+        <w:t> </w:t>
+      </w:r>
+      <w:r>
+        <w:rPr>
+          <w:lang w:val="ru-RU"/>
+        </w:rPr>
+        <w:t xml:space="preserve">Постійна пам’ять: не менше 2 ГБ вільного дискового простору для розгортання віртуального середовища </w:t>
+      </w:r>
+      <w:r>
+        <w:rPr>
+          <w:lang w:val="en-US"/>
+        </w:rPr>
+        <w:t>Python</w:t>
+      </w:r>
+      <w:r>
+        <w:rPr>
+          <w:lang w:val="ru-RU"/>
+        </w:rPr>
+        <w:t xml:space="preserve">, кешу графів та бази даних </w:t>
+      </w:r>
+      <w:r>
+        <w:rPr>
+          <w:lang w:val="en-US"/>
+        </w:rPr>
+        <w:t>SQLite</w:t>
+      </w:r>
+      <w:r>
+        <w:rPr>
+          <w:lang w:val="ru-RU"/>
+        </w:rPr>
+        <w:t>;</w:t>
+      </w:r>
+    </w:p>
+    <w:p>
+      <w:pPr>
+        <w:ind w:firstLine="709"/>
+        <w:rPr>
+          <w:lang w:val="ru-RU"/>
+        </w:rPr>
+      </w:pPr>
+      <w:r>
+        <w:rPr>
+          <w:lang w:val="ru-RU"/>
+        </w:rPr>
+        <w:t>–</w:t>
+      </w:r>
+      <w:r>
+        <w:rPr>
+          <w:lang w:val="ru-RU"/>
+        </w:rPr>
+        <w:t> </w:t>
+      </w:r>
+      <w:r>
+        <w:rPr>
+          <w:lang w:val="ru-RU"/>
+        </w:rPr>
+        <w:t xml:space="preserve">Мережеве з’єднання: широкосмуговий доступ до мережі Інтернет зі швидкістю не менше 10 Мбіт/с для завантаження картографічних даних з серверів </w:t>
+      </w:r>
+      <w:r>
+        <w:rPr>
+          <w:lang w:val="en-US"/>
+        </w:rPr>
+        <w:t>OpenStreetMap</w:t>
+      </w:r>
+      <w:r>
+        <w:rPr>
+          <w:lang w:val="ru-RU"/>
+        </w:rPr>
+        <w:t xml:space="preserve"> та звернень до </w:t>
+      </w:r>
+      <w:r>
+        <w:rPr>
+          <w:lang w:val="en-US"/>
+        </w:rPr>
+        <w:t>Nominatim</w:t>
+      </w:r>
+      <w:r>
+        <w:rPr>
+          <w:lang w:val="ru-RU"/>
+        </w:rPr>
+        <w:t>;</w:t>
+      </w:r>
+    </w:p>
+    <w:p>
+      <w:pPr>
+        <w:ind w:firstLine="709"/>
+        <w:rPr>
+          <w:lang w:val="en-US"/>
+        </w:rPr>
+      </w:pPr>
+      <w:r>
+        <w:rPr>
+          <w:lang w:val="ru-RU"/>
+        </w:rPr>
+        <w:t>–</w:t>
+      </w:r>
+      <w:r>
+        <w:rPr>
+          <w:lang w:val="ru-RU"/>
+        </w:rPr>
+        <w:t> </w:t>
+      </w:r>
+      <w:r>
+        <w:rPr>
+          <w:lang w:val="ru-RU"/>
+        </w:rPr>
+        <w:t xml:space="preserve">Операційна система: </w:t>
+      </w:r>
+      <w:r>
+        <w:rPr>
+          <w:lang w:val="en-US"/>
+        </w:rPr>
+        <w:t>Windows</w:t>
+      </w:r>
+      <w:r>
+        <w:rPr>
+          <w:lang w:val="ru-RU"/>
+        </w:rPr>
+        <w:t xml:space="preserve"> 10/11, </w:t>
+      </w:r>
+      <w:r>
+        <w:rPr>
+          <w:lang w:val="en-US"/>
+        </w:rPr>
+        <w:t>Ubuntu</w:t>
+      </w:r>
+      <w:r>
+        <w:rPr>
+          <w:lang w:val="ru-RU"/>
+        </w:rPr>
+        <w:t xml:space="preserve"> 20.04</w:t>
+      </w:r>
+      <w:r>
+        <w:rPr>
+          <w:lang w:val="ru-RU"/>
+        </w:rPr>
+        <w:t>+</w:t>
+      </w:r>
+      <w:r>
+        <w:rPr>
+          <w:lang w:val="ru-RU"/>
+        </w:rPr>
+        <w:t xml:space="preserve"> або </w:t>
+      </w:r>
+      <w:r>
+        <w:rPr>
+          <w:lang w:val="en-US"/>
+        </w:rPr>
+        <w:t>macOS</w:t>
+      </w:r>
+      <w:r>
+        <w:rPr>
+          <w:lang w:val="ru-RU"/>
+        </w:rPr>
+        <w:t xml:space="preserve"> 12</w:t>
+      </w:r>
+      <w:r>
+        <w:rPr>
+          <w:lang w:val="ru-RU"/>
+        </w:rPr>
+        <w:t>+</w:t>
+      </w:r>
+      <w:r>
+        <w:rPr>
+          <w:lang w:val="ru-RU"/>
+        </w:rPr>
+        <w:t>.</w:t>
+      </w:r>
+    </w:p>
+    <w:p>
+      <w:pPr>
+        <w:ind w:firstLine="709"/>
+        <w:rPr>
+          <w:lang w:val="ru-RU"/>
+        </w:rPr>
+      </w:pPr>
+      <w:r>
+        <w:rPr>
+          <w:lang w:val="ru-RU"/>
+        </w:rPr>
+        <w:t xml:space="preserve">З боку клієнта достатньо будь-якого сучасного веб-браузера з підтримкою </w:t>
+      </w:r>
+      <w:r>
+        <w:rPr>
+          <w:lang w:val="en-US"/>
+        </w:rPr>
+        <w:t>JavaScript</w:t>
+      </w:r>
+      <w:r>
+        <w:rPr>
+          <w:lang w:val="ru-RU"/>
+        </w:rPr>
+        <w:t xml:space="preserve"> (</w:t>
+      </w:r>
+      <w:r>
+        <w:rPr>
+          <w:lang w:val="en-US"/>
+        </w:rPr>
+        <w:t>Google</w:t>
+      </w:r>
+      <w:r>
+        <w:rPr>
+          <w:lang w:val="ru-RU"/>
+        </w:rPr>
+        <w:t xml:space="preserve"> </w:t>
+      </w:r>
+      <w:r>
+        <w:rPr>
+          <w:lang w:val="en-US"/>
+        </w:rPr>
+        <w:t>Chrome</w:t>
+      </w:r>
+      <w:r>
+        <w:rPr>
+          <w:lang w:val="ru-RU"/>
+        </w:rPr>
+        <w:t xml:space="preserve">, </w:t>
+      </w:r>
+      <w:r>
+        <w:rPr>
+          <w:lang w:val="en-US"/>
+        </w:rPr>
+        <w:t>Mozilla</w:t>
+      </w:r>
+      <w:r>
+        <w:rPr>
+          <w:lang w:val="ru-RU"/>
+        </w:rPr>
+        <w:t xml:space="preserve"> </w:t>
+      </w:r>
+      <w:r>
+        <w:rPr>
+          <w:lang w:val="en-US"/>
+        </w:rPr>
+        <w:t>Firefox</w:t>
+      </w:r>
+      <w:r>
+        <w:rPr>
+          <w:lang w:val="ru-RU"/>
+        </w:rPr>
+        <w:t xml:space="preserve">, </w:t>
+      </w:r>
+      <w:r>
+        <w:rPr>
+          <w:lang w:val="en-US"/>
+        </w:rPr>
+        <w:t>Microsoft</w:t>
+      </w:r>
+      <w:r>
+        <w:rPr>
+          <w:lang w:val="ru-RU"/>
+        </w:rPr>
+        <w:t xml:space="preserve"> </w:t>
+      </w:r>
+      <w:r>
+        <w:rPr>
+          <w:lang w:val="en-US"/>
+        </w:rPr>
+        <w:t>Edge</w:t>
+      </w:r>
+      <w:r>
+        <w:rPr>
+          <w:lang w:val="ru-RU"/>
+        </w:rPr>
+        <w:t>) та з’єднання з сервером по локальній мережі або через мережу Інтернет.</w:t>
+      </w:r>
+    </w:p>
+    <w:p>
+      <w:pPr>
+        <w:ind w:firstLine="709"/>
+      </w:pPr>
+    </w:p>
+    <w:p>
+      <w:pPr>
+        <w:ind w:firstLine="709"/>
+        <w:rPr>
+          <w:lang w:val="en-US"/>
+        </w:rPr>
+      </w:pPr>
+    </w:p>
+    <w:p>
+      <w:pPr>
+        <w:pStyle w:val="Heading2"/>
+      </w:pPr>
+      <w:r>
+        <w:rPr>
+          <w:lang w:val="ru-RU"/>
+        </w:rPr>
+        <w:t xml:space="preserve">3.3 </w:t>
+      </w:r>
+      <w:r>
+        <w:t>Опис програми</w:t>
+      </w:r>
+    </w:p>
+    <w:p>
+      <w:pPr>
+        <w:ind w:firstLine="709"/>
+        <w:rPr>
+          <w:lang w:val="ru-RU"/>
+        </w:rPr>
+      </w:pPr>
+    </w:p>
+    <w:p>
+      <w:pPr>
+        <w:ind w:firstLine="709"/>
+        <w:rPr>
+          <w:lang w:val="en-US"/>
+        </w:rPr>
+      </w:pPr>
+    </w:p>
+    <w:p>
+      <w:pPr>
+        <w:ind w:firstLine="709"/>
+        <w:rPr>
+          <w:lang w:val="en-US"/>
+        </w:rPr>
+      </w:pPr>
+      <w:r>
+        <w:t xml:space="preserve">Архітектура програми. Програмний продукт реалізовано за модульним принципом з використанням об’єктно-орієнтованого підходу. Це забезпечує гнучкість налаштування параметрів генетичного алгоритму та зручність </w:t>
+      </w:r>
+      <w:r>
+        <w:lastRenderedPageBreak/>
+        <w:t>інтеграції з геоінформаційними сервісами</w:t>
+      </w:r>
+      <w:r>
+        <w:t>.</w:t>
+      </w:r>
+    </w:p>
+    <w:p>
+      <w:pPr>
+        <w:ind w:firstLine="709"/>
+        <w:rPr>
+          <w:lang w:val="en-US"/>
+        </w:rPr>
+      </w:pPr>
+      <w:r>
+        <w:rPr>
+          <w:lang w:val="ru-RU"/>
+        </w:rPr>
+        <w:t>Основні</w:t>
+      </w:r>
+      <w:r>
+        <w:rPr>
+          <w:lang w:val="en-US"/>
+        </w:rPr>
+        <w:t xml:space="preserve"> </w:t>
+      </w:r>
+      <w:r>
+        <w:rPr>
+          <w:lang w:val="ru-RU"/>
+        </w:rPr>
+        <w:t>програмні</w:t>
+      </w:r>
+      <w:r>
+        <w:rPr>
+          <w:lang w:val="en-US"/>
+        </w:rPr>
+        <w:t xml:space="preserve"> </w:t>
+      </w:r>
+      <w:r>
+        <w:rPr>
+          <w:lang w:val="ru-RU"/>
+        </w:rPr>
+        <w:t>модулі</w:t>
+      </w:r>
+      <w:r>
+        <w:rPr>
+          <w:lang w:val="en-US"/>
+        </w:rPr>
+        <w:t>:</w:t>
+      </w:r>
+    </w:p>
+    <w:p>
+      <w:pPr>
+        <w:ind w:firstLine="709"/>
+        <w:rPr>
+          <w:lang w:val="en-US"/>
+        </w:rPr>
+      </w:pPr>
+      <w:r>
+        <w:rPr>
+          <w:lang w:val="en-US"/>
+        </w:rPr>
+        <w:t>– </w:t>
+      </w:r>
+      <w:r>
+        <w:rPr>
+          <w:lang w:val="en-US"/>
+        </w:rPr>
+        <w:t>App</w:t>
+      </w:r>
+      <w:r>
+        <w:rPr>
+          <w:lang w:val="en-US"/>
+        </w:rPr>
+        <w:t xml:space="preserve"> </w:t>
+      </w:r>
+      <w:r>
+        <w:rPr>
+          <w:lang w:val="en-US"/>
+        </w:rPr>
+        <w:t>–</w:t>
+      </w:r>
+      <w:r>
+        <w:rPr>
+          <w:lang w:val="en-US"/>
+        </w:rPr>
+        <w:t xml:space="preserve"> </w:t>
+      </w:r>
+      <w:r>
+        <w:rPr>
+          <w:lang w:val="ru-RU"/>
+        </w:rPr>
+        <w:t>центральний</w:t>
+      </w:r>
+      <w:r>
+        <w:rPr>
+          <w:lang w:val="en-US"/>
+        </w:rPr>
+        <w:t xml:space="preserve"> </w:t>
+      </w:r>
+      <w:r>
+        <w:rPr>
+          <w:lang w:val="ru-RU"/>
+        </w:rPr>
+        <w:t>контролер</w:t>
+      </w:r>
+      <w:r>
+        <w:rPr>
+          <w:lang w:val="en-US"/>
+        </w:rPr>
+        <w:t xml:space="preserve"> </w:t>
+      </w:r>
+      <w:r>
+        <w:rPr>
+          <w:lang w:val="ru-RU"/>
+        </w:rPr>
+        <w:t>системи</w:t>
+      </w:r>
+      <w:r>
+        <w:rPr>
+          <w:lang w:val="en-US"/>
+        </w:rPr>
+        <w:t xml:space="preserve">, </w:t>
+      </w:r>
+      <w:r>
+        <w:rPr>
+          <w:lang w:val="ru-RU"/>
+        </w:rPr>
+        <w:t>що</w:t>
+      </w:r>
+      <w:r>
+        <w:rPr>
+          <w:lang w:val="en-US"/>
+        </w:rPr>
+        <w:t xml:space="preserve"> </w:t>
+      </w:r>
+      <w:r>
+        <w:rPr>
+          <w:lang w:val="ru-RU"/>
+        </w:rPr>
+        <w:t>забезпечує</w:t>
+      </w:r>
+      <w:r>
+        <w:rPr>
+          <w:lang w:val="en-US"/>
+        </w:rPr>
+        <w:t xml:space="preserve"> </w:t>
+      </w:r>
+      <w:r>
+        <w:rPr>
+          <w:lang w:val="ru-RU"/>
+        </w:rPr>
+        <w:t>користувацький</w:t>
+      </w:r>
+      <w:r>
+        <w:rPr>
+          <w:lang w:val="en-US"/>
+        </w:rPr>
+        <w:t xml:space="preserve"> </w:t>
+      </w:r>
+      <w:r>
+        <w:rPr>
+          <w:lang w:val="ru-RU"/>
+        </w:rPr>
+        <w:t>інтерфейс</w:t>
+      </w:r>
+      <w:r>
+        <w:rPr>
+          <w:lang w:val="en-US"/>
+        </w:rPr>
+        <w:t xml:space="preserve">, </w:t>
+      </w:r>
+      <w:r>
+        <w:rPr>
+          <w:lang w:val="ru-RU"/>
+        </w:rPr>
+        <w:t>координує</w:t>
+      </w:r>
+      <w:r>
+        <w:rPr>
+          <w:lang w:val="en-US"/>
+        </w:rPr>
+        <w:t xml:space="preserve"> </w:t>
+      </w:r>
+      <w:r>
+        <w:rPr>
+          <w:lang w:val="ru-RU"/>
+        </w:rPr>
+        <w:t>збір</w:t>
+      </w:r>
+      <w:r>
+        <w:rPr>
+          <w:lang w:val="en-US"/>
+        </w:rPr>
+        <w:t xml:space="preserve"> </w:t>
+      </w:r>
+      <w:r>
+        <w:rPr>
+          <w:lang w:val="ru-RU"/>
+        </w:rPr>
+        <w:t>вхідних</w:t>
+      </w:r>
+      <w:r>
+        <w:rPr>
+          <w:lang w:val="en-US"/>
+        </w:rPr>
+        <w:t xml:space="preserve"> </w:t>
+      </w:r>
+      <w:r>
+        <w:rPr>
+          <w:lang w:val="ru-RU"/>
+        </w:rPr>
+        <w:t>даних</w:t>
+      </w:r>
+      <w:r>
+        <w:rPr>
+          <w:lang w:val="en-US"/>
+        </w:rPr>
+        <w:t xml:space="preserve"> </w:t>
+      </w:r>
+      <w:r>
+        <w:rPr>
+          <w:lang w:val="ru-RU"/>
+        </w:rPr>
+        <w:t>та</w:t>
+      </w:r>
+      <w:r>
+        <w:rPr>
+          <w:lang w:val="en-US"/>
+        </w:rPr>
+        <w:t xml:space="preserve"> </w:t>
+      </w:r>
+      <w:r>
+        <w:rPr>
+          <w:lang w:val="ru-RU"/>
+        </w:rPr>
+        <w:t>ініціює</w:t>
+      </w:r>
+      <w:r>
+        <w:rPr>
+          <w:lang w:val="en-US"/>
+        </w:rPr>
+        <w:t xml:space="preserve"> </w:t>
+      </w:r>
+      <w:r>
+        <w:rPr>
+          <w:lang w:val="ru-RU"/>
+        </w:rPr>
+        <w:t>процес</w:t>
+      </w:r>
+      <w:r>
+        <w:rPr>
+          <w:lang w:val="en-US"/>
+        </w:rPr>
+        <w:t xml:space="preserve"> </w:t>
+      </w:r>
+      <w:r>
+        <w:rPr>
+          <w:lang w:val="ru-RU"/>
+        </w:rPr>
+        <w:t>оптимізації</w:t>
+      </w:r>
+      <w:r>
+        <w:rPr>
+          <w:lang w:val="en-US"/>
+        </w:rPr>
+        <w:t>;</w:t>
+      </w:r>
+    </w:p>
+    <w:p>
+      <w:pPr>
+        <w:ind w:firstLine="709"/>
+        <w:rPr>
+          <w:lang w:val="en-US"/>
+        </w:rPr>
+      </w:pPr>
+      <w:r>
+        <w:rPr>
+          <w:lang w:val="en-US"/>
+        </w:rPr>
+        <w:t>– </w:t>
+      </w:r>
+      <w:r>
+        <w:rPr>
+          <w:lang w:val="en-US"/>
+        </w:rPr>
+        <w:t xml:space="preserve">GraphBuilder </w:t>
+      </w:r>
+      <w:r>
+        <w:rPr>
+          <w:lang w:val="en-US"/>
+        </w:rPr>
+        <w:t>–</w:t>
+      </w:r>
+      <w:r>
+        <w:rPr>
+          <w:lang w:val="en-US"/>
+        </w:rPr>
+        <w:t xml:space="preserve"> </w:t>
+      </w:r>
+      <w:r>
+        <w:rPr>
+          <w:lang w:val="ru-RU"/>
+        </w:rPr>
+        <w:t>модуль</w:t>
+      </w:r>
+      <w:r>
+        <w:rPr>
+          <w:lang w:val="en-US"/>
+        </w:rPr>
+        <w:t xml:space="preserve">, </w:t>
+      </w:r>
+      <w:r>
+        <w:rPr>
+          <w:lang w:val="ru-RU"/>
+        </w:rPr>
+        <w:t>відповідальний</w:t>
+      </w:r>
+      <w:r>
+        <w:rPr>
+          <w:lang w:val="en-US"/>
+        </w:rPr>
+        <w:t xml:space="preserve"> </w:t>
+      </w:r>
+      <w:r>
+        <w:rPr>
+          <w:lang w:val="ru-RU"/>
+        </w:rPr>
+        <w:t>за</w:t>
+      </w:r>
+      <w:r>
+        <w:rPr>
+          <w:lang w:val="en-US"/>
+        </w:rPr>
+        <w:t xml:space="preserve"> </w:t>
+      </w:r>
+      <w:r>
+        <w:rPr>
+          <w:lang w:val="ru-RU"/>
+        </w:rPr>
+        <w:t>завантаження</w:t>
+      </w:r>
+      <w:r>
+        <w:rPr>
+          <w:lang w:val="en-US"/>
+        </w:rPr>
+        <w:t xml:space="preserve"> </w:t>
+      </w:r>
+      <w:r>
+        <w:rPr>
+          <w:lang w:val="ru-RU"/>
+        </w:rPr>
+        <w:t>картографічних</w:t>
+      </w:r>
+      <w:r>
+        <w:rPr>
+          <w:lang w:val="en-US"/>
+        </w:rPr>
+        <w:t xml:space="preserve"> </w:t>
+      </w:r>
+      <w:r>
+        <w:rPr>
+          <w:lang w:val="ru-RU"/>
+        </w:rPr>
+        <w:t>даних</w:t>
+      </w:r>
+      <w:r>
+        <w:rPr>
+          <w:lang w:val="en-US"/>
+        </w:rPr>
+        <w:t xml:space="preserve"> </w:t>
+      </w:r>
+      <w:r>
+        <w:rPr>
+          <w:lang w:val="ru-RU"/>
+        </w:rPr>
+        <w:t>з</w:t>
+      </w:r>
+      <w:r>
+        <w:rPr>
+          <w:lang w:val="en-US"/>
+        </w:rPr>
+        <w:t xml:space="preserve"> OpenStreetMap </w:t>
+      </w:r>
+      <w:r>
+        <w:rPr>
+          <w:lang w:val="ru-RU"/>
+        </w:rPr>
+        <w:t>за</w:t>
+      </w:r>
+      <w:r>
+        <w:rPr>
+          <w:lang w:val="en-US"/>
+        </w:rPr>
+        <w:t xml:space="preserve"> </w:t>
+      </w:r>
+      <w:r>
+        <w:rPr>
+          <w:lang w:val="ru-RU"/>
+        </w:rPr>
+        <w:t>допомогою</w:t>
+      </w:r>
+      <w:r>
+        <w:rPr>
+          <w:lang w:val="en-US"/>
+        </w:rPr>
+        <w:t xml:space="preserve"> </w:t>
+      </w:r>
+      <w:r>
+        <w:rPr>
+          <w:lang w:val="ru-RU"/>
+        </w:rPr>
+        <w:t>бібліотеки</w:t>
+      </w:r>
+      <w:r>
+        <w:rPr>
+          <w:lang w:val="en-US"/>
+        </w:rPr>
+        <w:t xml:space="preserve"> OSMnx </w:t>
+      </w:r>
+      <w:r>
+        <w:rPr>
+          <w:lang w:val="ru-RU"/>
+        </w:rPr>
+        <w:t>та</w:t>
+      </w:r>
+      <w:r>
+        <w:rPr>
+          <w:lang w:val="en-US"/>
+        </w:rPr>
+        <w:t xml:space="preserve"> </w:t>
+      </w:r>
+      <w:r>
+        <w:rPr>
+          <w:lang w:val="ru-RU"/>
+        </w:rPr>
+        <w:t>розрахунок</w:t>
+      </w:r>
+      <w:r>
+        <w:rPr>
+          <w:lang w:val="en-US"/>
+        </w:rPr>
+        <w:t xml:space="preserve"> </w:t>
+      </w:r>
+      <w:r>
+        <w:rPr>
+          <w:lang w:val="ru-RU"/>
+        </w:rPr>
+        <w:t>матриць</w:t>
+      </w:r>
+      <w:r>
+        <w:rPr>
+          <w:lang w:val="en-US"/>
+        </w:rPr>
+        <w:t xml:space="preserve"> </w:t>
+      </w:r>
+      <w:r>
+        <w:rPr>
+          <w:lang w:val="ru-RU"/>
+        </w:rPr>
+        <w:t>часових</w:t>
+      </w:r>
+      <w:r>
+        <w:rPr>
+          <w:lang w:val="en-US"/>
+        </w:rPr>
+        <w:t xml:space="preserve"> </w:t>
+      </w:r>
+      <w:r>
+        <w:rPr>
+          <w:lang w:val="ru-RU"/>
+        </w:rPr>
+        <w:t>витрат</w:t>
+      </w:r>
+      <w:r>
+        <w:rPr>
+          <w:lang w:val="en-US"/>
+        </w:rPr>
+        <w:t xml:space="preserve"> </w:t>
+      </w:r>
+      <w:r>
+        <w:rPr>
+          <w:lang w:val="ru-RU"/>
+        </w:rPr>
+        <w:t>для</w:t>
+      </w:r>
+      <w:r>
+        <w:rPr>
+          <w:lang w:val="en-US"/>
+        </w:rPr>
+        <w:t xml:space="preserve"> </w:t>
+      </w:r>
+      <w:r>
+        <w:rPr>
+          <w:lang w:val="ru-RU"/>
+        </w:rPr>
+        <w:t>мультимодальної</w:t>
+      </w:r>
+      <w:r>
+        <w:rPr>
+          <w:lang w:val="en-US"/>
+        </w:rPr>
+        <w:t xml:space="preserve"> </w:t>
+      </w:r>
+      <w:r>
+        <w:rPr>
+          <w:lang w:val="ru-RU"/>
+        </w:rPr>
+        <w:t>мережі</w:t>
+      </w:r>
+      <w:r>
+        <w:rPr>
+          <w:lang w:val="en-US"/>
+        </w:rPr>
+        <w:t xml:space="preserve"> (</w:t>
+      </w:r>
+      <w:r>
+        <w:rPr>
+          <w:lang w:val="ru-RU"/>
+        </w:rPr>
+        <w:t>авто</w:t>
+      </w:r>
+      <w:r>
+        <w:rPr>
+          <w:lang w:val="en-US"/>
+        </w:rPr>
+        <w:t xml:space="preserve">, </w:t>
+      </w:r>
+      <w:r>
+        <w:rPr>
+          <w:lang w:val="ru-RU"/>
+        </w:rPr>
+        <w:t>вело</w:t>
+      </w:r>
+      <w:r>
+        <w:rPr>
+          <w:lang w:val="en-US"/>
+        </w:rPr>
+        <w:t xml:space="preserve">, </w:t>
+      </w:r>
+      <w:r>
+        <w:rPr>
+          <w:lang w:val="ru-RU"/>
+        </w:rPr>
+        <w:t>пішохід</w:t>
+      </w:r>
+      <w:r>
+        <w:rPr>
+          <w:lang w:val="en-US"/>
+        </w:rPr>
+        <w:t>)</w:t>
+      </w:r>
+      <w:r>
+        <w:rPr>
+          <w:lang w:val="en-US"/>
+        </w:rPr>
+        <w:t>;</w:t>
+      </w:r>
+    </w:p>
+    <w:p>
+      <w:pPr>
+        <w:ind w:firstLine="709"/>
+        <w:rPr>
+          <w:lang w:val="ru-RU"/>
+        </w:rPr>
+      </w:pPr>
+      <w:r>
+        <w:rPr>
+          <w:lang w:val="en-US"/>
+        </w:rPr>
+        <w:t>– </w:t>
+      </w:r>
+      <w:r>
+        <w:rPr>
+          <w:lang w:val="en-US"/>
+        </w:rPr>
+        <w:t>VRPSolver</w:t>
+      </w:r>
+      <w:r>
+        <w:rPr>
+          <w:lang w:val="ru-RU"/>
+        </w:rPr>
+        <w:t xml:space="preserve"> </w:t>
+      </w:r>
+      <w:r>
+        <w:rPr>
+          <w:lang w:val="ru-RU"/>
+        </w:rPr>
+        <w:t>–</w:t>
+      </w:r>
+      <w:r>
+        <w:rPr>
+          <w:lang w:val="ru-RU"/>
+        </w:rPr>
+        <w:t xml:space="preserve"> </w:t>
+      </w:r>
+      <w:r>
+        <w:rPr>
+          <w:lang w:val="ru-RU"/>
+        </w:rPr>
+        <w:t>ядро</w:t>
+      </w:r>
+      <w:r>
+        <w:rPr>
+          <w:lang w:val="ru-RU"/>
+        </w:rPr>
+        <w:t xml:space="preserve"> </w:t>
+      </w:r>
+      <w:r>
+        <w:rPr>
+          <w:lang w:val="ru-RU"/>
+        </w:rPr>
+        <w:t>системи</w:t>
+      </w:r>
+      <w:r>
+        <w:rPr>
+          <w:lang w:val="ru-RU"/>
+        </w:rPr>
+        <w:t xml:space="preserve">, </w:t>
+      </w:r>
+      <w:r>
+        <w:rPr>
+          <w:lang w:val="ru-RU"/>
+        </w:rPr>
+        <w:t>що</w:t>
+      </w:r>
+      <w:r>
+        <w:rPr>
+          <w:lang w:val="ru-RU"/>
+        </w:rPr>
+        <w:t xml:space="preserve"> </w:t>
+      </w:r>
+      <w:r>
+        <w:rPr>
+          <w:lang w:val="ru-RU"/>
+        </w:rPr>
+        <w:t>реалізує</w:t>
+      </w:r>
+      <w:r>
+        <w:rPr>
+          <w:lang w:val="ru-RU"/>
+        </w:rPr>
+        <w:t xml:space="preserve"> </w:t>
+      </w:r>
+      <w:r>
+        <w:rPr>
+          <w:lang w:val="ru-RU"/>
+        </w:rPr>
+        <w:t>генетичний</w:t>
+      </w:r>
+      <w:r>
+        <w:rPr>
+          <w:lang w:val="ru-RU"/>
+        </w:rPr>
+        <w:t xml:space="preserve"> </w:t>
+      </w:r>
+      <w:r>
+        <w:rPr>
+          <w:lang w:val="ru-RU"/>
+        </w:rPr>
+        <w:t>алгоритм</w:t>
+      </w:r>
+      <w:r>
+        <w:rPr>
+          <w:lang w:val="ru-RU"/>
+        </w:rPr>
+        <w:t xml:space="preserve">. </w:t>
+      </w:r>
+      <w:r>
+        <w:rPr>
+          <w:lang w:val="ru-RU"/>
+        </w:rPr>
+        <w:t>Модуль</w:t>
+      </w:r>
+      <w:r>
+        <w:rPr>
+          <w:lang w:val="ru-RU"/>
+        </w:rPr>
+        <w:t xml:space="preserve"> </w:t>
+      </w:r>
+      <w:r>
+        <w:rPr>
+          <w:lang w:val="ru-RU"/>
+        </w:rPr>
+        <w:t>містить</w:t>
+      </w:r>
+      <w:r>
+        <w:rPr>
+          <w:lang w:val="ru-RU"/>
+        </w:rPr>
+        <w:t xml:space="preserve"> </w:t>
+      </w:r>
+      <w:r>
+        <w:rPr>
+          <w:lang w:val="ru-RU"/>
+        </w:rPr>
+        <w:t>логіку</w:t>
+      </w:r>
+      <w:r>
+        <w:rPr>
+          <w:lang w:val="ru-RU"/>
+        </w:rPr>
+        <w:t xml:space="preserve"> </w:t>
+      </w:r>
+      <w:r>
+        <w:rPr>
+          <w:lang w:val="ru-RU"/>
+        </w:rPr>
+        <w:t>формування</w:t>
+      </w:r>
+      <w:r>
+        <w:rPr>
+          <w:lang w:val="ru-RU"/>
+        </w:rPr>
+        <w:t xml:space="preserve"> </w:t>
+      </w:r>
+      <w:r>
+        <w:rPr>
+          <w:lang w:val="ru-RU"/>
+        </w:rPr>
+        <w:t>початкової</w:t>
+      </w:r>
+      <w:r>
+        <w:rPr>
+          <w:lang w:val="ru-RU"/>
+        </w:rPr>
+        <w:t xml:space="preserve"> </w:t>
+      </w:r>
+      <w:r>
+        <w:rPr>
+          <w:lang w:val="ru-RU"/>
+        </w:rPr>
+        <w:t>популяції</w:t>
+      </w:r>
+      <w:r>
+        <w:rPr>
+          <w:lang w:val="ru-RU"/>
+        </w:rPr>
+        <w:t xml:space="preserve"> («</w:t>
+      </w:r>
+      <w:r>
+        <w:rPr>
+          <w:lang w:val="ru-RU"/>
+        </w:rPr>
+        <w:t>теплий</w:t>
+      </w:r>
+      <w:r>
+        <w:rPr>
+          <w:lang w:val="ru-RU"/>
+        </w:rPr>
+        <w:t xml:space="preserve"> </w:t>
+      </w:r>
+      <w:r>
+        <w:rPr>
+          <w:lang w:val="ru-RU"/>
+        </w:rPr>
+        <w:t>старт</w:t>
+      </w:r>
+      <w:r>
+        <w:rPr>
+          <w:lang w:val="ru-RU"/>
+        </w:rPr>
+        <w:t xml:space="preserve">»), </w:t>
+      </w:r>
+      <w:r>
+        <w:rPr>
+          <w:lang w:val="ru-RU"/>
+        </w:rPr>
+        <w:t>оператори</w:t>
+      </w:r>
+      <w:r>
+        <w:rPr>
+          <w:lang w:val="ru-RU"/>
+        </w:rPr>
+        <w:t xml:space="preserve"> </w:t>
+      </w:r>
+      <w:r>
+        <w:rPr>
+          <w:lang w:val="ru-RU"/>
+        </w:rPr>
+        <w:t>селекції</w:t>
+      </w:r>
+      <w:r>
+        <w:rPr>
+          <w:lang w:val="ru-RU"/>
+        </w:rPr>
+        <w:t xml:space="preserve">, </w:t>
+      </w:r>
+      <w:r>
+        <w:rPr>
+          <w:lang w:val="en-US"/>
+        </w:rPr>
+        <w:t>OX</w:t>
+      </w:r>
+      <w:r>
+        <w:rPr>
+          <w:lang w:val="ru-RU"/>
+        </w:rPr>
+        <w:t>-</w:t>
+      </w:r>
+      <w:r>
+        <w:rPr>
+          <w:lang w:val="ru-RU"/>
+        </w:rPr>
+        <w:t>схрещування</w:t>
+      </w:r>
+      <w:r>
+        <w:rPr>
+          <w:lang w:val="ru-RU"/>
+        </w:rPr>
+        <w:t xml:space="preserve"> </w:t>
+      </w:r>
+      <w:r>
+        <w:rPr>
+          <w:lang w:val="ru-RU"/>
+        </w:rPr>
+        <w:t>та</w:t>
+      </w:r>
+      <w:r>
+        <w:rPr>
+          <w:lang w:val="ru-RU"/>
+        </w:rPr>
+        <w:t xml:space="preserve"> </w:t>
+      </w:r>
+      <w:r>
+        <w:rPr>
+          <w:lang w:val="en-US"/>
+        </w:rPr>
+        <w:t>swap</w:t>
+      </w:r>
+      <w:r>
+        <w:rPr>
+          <w:lang w:val="ru-RU"/>
+        </w:rPr>
+        <w:t>-</w:t>
+      </w:r>
+      <w:r>
+        <w:rPr>
+          <w:lang w:val="ru-RU"/>
+        </w:rPr>
+        <w:t>мутації</w:t>
+      </w:r>
+      <w:r>
+        <w:rPr>
+          <w:lang w:val="ru-RU"/>
+        </w:rPr>
+        <w:t>;</w:t>
+      </w:r>
+    </w:p>
+    <w:p>
+      <w:pPr>
+        <w:ind w:firstLine="709"/>
+        <w:rPr>
+          <w:lang w:val="en-US"/>
+        </w:rPr>
+      </w:pPr>
+      <w:r>
+        <w:rPr>
+          <w:lang w:val="en-US"/>
+        </w:rPr>
+        <w:t>– </w:t>
+      </w:r>
+      <w:r>
+        <w:rPr>
+          <w:lang w:val="en-US"/>
+        </w:rPr>
+        <w:t xml:space="preserve">Data Models </w:t>
+      </w:r>
+      <w:r>
+        <w:rPr>
+          <w:lang w:val="en-US"/>
+        </w:rPr>
+        <w:t>–</w:t>
+      </w:r>
+      <w:r>
+        <w:rPr>
+          <w:lang w:val="en-US"/>
+        </w:rPr>
+        <w:t xml:space="preserve"> </w:t>
+      </w:r>
+      <w:r>
+        <w:rPr>
+          <w:lang w:val="ru-RU"/>
+        </w:rPr>
+        <w:t>сукупність</w:t>
+      </w:r>
+      <w:r>
+        <w:rPr>
+          <w:lang w:val="en-US"/>
+        </w:rPr>
+        <w:t xml:space="preserve"> </w:t>
+      </w:r>
+      <w:r>
+        <w:rPr>
+          <w:lang w:val="ru-RU"/>
+        </w:rPr>
+        <w:t>класів</w:t>
+      </w:r>
+      <w:r>
+        <w:rPr>
+          <w:lang w:val="en-US"/>
+        </w:rPr>
+        <w:t xml:space="preserve"> (DeliveryStop, Vehicle, LegInfo), </w:t>
+      </w:r>
+      <w:r>
+        <w:rPr>
+          <w:lang w:val="ru-RU"/>
+        </w:rPr>
+        <w:t>що</w:t>
+      </w:r>
+      <w:r>
+        <w:rPr>
+          <w:lang w:val="en-US"/>
+        </w:rPr>
+        <w:t xml:space="preserve"> </w:t>
+      </w:r>
+      <w:r>
+        <w:rPr>
+          <w:lang w:val="ru-RU"/>
+        </w:rPr>
+        <w:t>описують</w:t>
+      </w:r>
+      <w:r>
+        <w:rPr>
+          <w:lang w:val="en-US"/>
+        </w:rPr>
+        <w:t xml:space="preserve"> </w:t>
+      </w:r>
+      <w:r>
+        <w:rPr>
+          <w:lang w:val="ru-RU"/>
+        </w:rPr>
+        <w:t>сутності</w:t>
+      </w:r>
+      <w:r>
+        <w:rPr>
+          <w:lang w:val="en-US"/>
+        </w:rPr>
+        <w:t xml:space="preserve"> </w:t>
+      </w:r>
+      <w:r>
+        <w:rPr>
+          <w:lang w:val="ru-RU"/>
+        </w:rPr>
+        <w:t>логістичної</w:t>
+      </w:r>
+      <w:r>
+        <w:rPr>
+          <w:lang w:val="en-US"/>
+        </w:rPr>
+        <w:t xml:space="preserve"> </w:t>
+      </w:r>
+      <w:r>
+        <w:rPr>
+          <w:lang w:val="ru-RU"/>
+        </w:rPr>
+        <w:t>мережі</w:t>
+      </w:r>
+      <w:r>
+        <w:rPr>
+          <w:lang w:val="en-US"/>
+        </w:rPr>
+        <w:t xml:space="preserve"> </w:t>
+      </w:r>
+      <w:r>
+        <w:rPr>
+          <w:lang w:val="ru-RU"/>
+        </w:rPr>
+        <w:t>та</w:t>
+      </w:r>
+      <w:r>
+        <w:rPr>
+          <w:lang w:val="en-US"/>
+        </w:rPr>
+        <w:t xml:space="preserve"> </w:t>
+      </w:r>
+      <w:r>
+        <w:rPr>
+          <w:lang w:val="ru-RU"/>
+        </w:rPr>
+        <w:t>їхні</w:t>
+      </w:r>
+      <w:r>
+        <w:rPr>
+          <w:lang w:val="en-US"/>
+        </w:rPr>
+        <w:t xml:space="preserve"> </w:t>
+      </w:r>
+      <w:r>
+        <w:rPr>
+          <w:lang w:val="ru-RU"/>
+        </w:rPr>
+        <w:t>атрибути</w:t>
+      </w:r>
+      <w:r>
+        <w:rPr>
+          <w:lang w:val="en-US"/>
+        </w:rPr>
+        <w:t xml:space="preserve">, </w:t>
+      </w:r>
+      <w:r>
+        <w:rPr>
+          <w:lang w:val="ru-RU"/>
+        </w:rPr>
+        <w:t>такі</w:t>
+      </w:r>
+      <w:r>
+        <w:rPr>
+          <w:lang w:val="en-US"/>
+        </w:rPr>
+        <w:t xml:space="preserve"> </w:t>
+      </w:r>
+      <w:r>
+        <w:rPr>
+          <w:lang w:val="ru-RU"/>
+        </w:rPr>
+        <w:t>як</w:t>
+      </w:r>
+      <w:r>
+        <w:rPr>
+          <w:lang w:val="en-US"/>
+        </w:rPr>
+        <w:t xml:space="preserve"> </w:t>
+      </w:r>
+      <w:r>
+        <w:rPr>
+          <w:lang w:val="ru-RU"/>
+        </w:rPr>
+        <w:t>часові</w:t>
+      </w:r>
+      <w:r>
+        <w:rPr>
+          <w:lang w:val="en-US"/>
+        </w:rPr>
+        <w:t xml:space="preserve"> </w:t>
+      </w:r>
+      <w:r>
+        <w:rPr>
+          <w:lang w:val="ru-RU"/>
+        </w:rPr>
+        <w:t>вікна</w:t>
+      </w:r>
+      <w:r>
+        <w:rPr>
+          <w:lang w:val="en-US"/>
+        </w:rPr>
+        <w:t xml:space="preserve"> </w:t>
+      </w:r>
+      <w:r>
+        <w:rPr>
+          <w:lang w:val="ru-RU"/>
+        </w:rPr>
+        <w:t>та</w:t>
+      </w:r>
+      <w:r>
+        <w:rPr>
+          <w:lang w:val="en-US"/>
+        </w:rPr>
+        <w:t xml:space="preserve"> </w:t>
+      </w:r>
+      <w:r>
+        <w:rPr>
+          <w:lang w:val="ru-RU"/>
+        </w:rPr>
+        <w:t>вантажомісткість</w:t>
+      </w:r>
+      <w:r>
+        <w:rPr>
+          <w:lang w:val="en-US"/>
+        </w:rPr>
+        <w:t>;</w:t>
+      </w:r>
+    </w:p>
+    <w:p>
+      <w:pPr>
+        <w:ind w:firstLine="709"/>
+      </w:pPr>
+      <w:r>
+        <w:rPr>
+          <w:lang w:val="en-US"/>
+        </w:rPr>
+        <w:t>– </w:t>
+      </w:r>
+      <w:r>
+        <w:rPr>
+          <w:lang w:val="ru-RU"/>
+        </w:rPr>
+        <w:t xml:space="preserve">PackageDB </w:t>
+      </w:r>
+      <w:r>
+        <w:rPr>
+          <w:lang w:val="ru-RU"/>
+        </w:rPr>
+        <w:t>–</w:t>
+      </w:r>
+      <w:r>
+        <w:rPr>
+          <w:lang w:val="ru-RU"/>
+        </w:rPr>
+        <w:t xml:space="preserve"> компонент для управління станом замовлень та забезпечення їхнього коректного розподілу між транспортними засобам</w:t>
+      </w:r>
+      <w:r>
+        <w:t>и.</w:t>
+      </w:r>
+    </w:p>
+    <w:p>
+      <w:pPr>
+        <w:ind w:firstLine="709"/>
+      </w:pPr>
+      <w:r>
+        <w:t>Для побудови системи задіяно набір бібліотек</w:t>
+      </w:r>
+      <w:r>
+        <w:t xml:space="preserve"> з </w:t>
+      </w:r>
+      <w:r>
+        <w:t>відкритим вихідним кодом</w:t>
+      </w:r>
+      <w:r>
+        <w:t>, перелік яких зафіксовано у файлі</w:t>
+      </w:r>
+      <w:r>
+        <w:t xml:space="preserve"> </w:t>
+      </w:r>
+      <w:r>
+        <w:rPr>
+          <w:lang w:val="en-US"/>
+        </w:rPr>
+        <w:t>requirements</w:t>
+      </w:r>
+      <w:r>
+        <w:t>.</w:t>
+      </w:r>
+      <w:r>
+        <w:rPr>
+          <w:lang w:val="en-US"/>
+        </w:rPr>
+        <w:t>txt</w:t>
+      </w:r>
+      <w:r>
+        <w:t>:</w:t>
+      </w:r>
+    </w:p>
+    <w:p>
+      <w:pPr>
+        <w:ind w:firstLine="709"/>
+        <w:rPr>
+          <w:lang w:val="ru-RU"/>
+        </w:rPr>
+      </w:pPr>
+      <w:r>
+        <w:rPr>
+          <w:lang w:val="ru-RU"/>
+        </w:rPr>
+        <w:t>–</w:t>
+      </w:r>
+      <w:r>
+        <w:rPr>
+          <w:lang w:val="ru-RU"/>
+        </w:rPr>
+        <w:t> </w:t>
+      </w:r>
+      <w:r>
+        <w:rPr>
+          <w:lang w:val="en-US"/>
+        </w:rPr>
+        <w:t>Streamlit</w:t>
+      </w:r>
+      <w:r>
+        <w:rPr>
+          <w:lang w:val="ru-RU"/>
+        </w:rPr>
+        <w:t xml:space="preserve"> – фреймворк для побудови інтерактивного веб-інтерфейсу. Дозволяє створювати багатосторінкові застосунки та забезпечує реактивне оновлення станів через механізм </w:t>
+      </w:r>
+      <w:r>
+        <w:rPr>
+          <w:lang w:val="ru-UA"/>
+        </w:rPr>
+        <w:t>сесії</w:t>
+      </w:r>
+    </w:p>
+    <w:p>
+      <w:pPr>
+        <w:ind w:firstLine="709"/>
+        <w:rPr>
+          <w:lang w:val="ru-RU"/>
+        </w:rPr>
+      </w:pPr>
+      <w:r>
+        <w:rPr>
+          <w:lang w:val="ru-RU"/>
+        </w:rPr>
+        <w:t>–</w:t>
+      </w:r>
+      <w:r>
+        <w:rPr>
+          <w:lang w:val="ru-RU"/>
+        </w:rPr>
+        <w:t> </w:t>
+      </w:r>
+      <w:r>
+        <w:rPr>
+          <w:lang w:val="ru-UA"/>
+        </w:rPr>
+        <w:t>OSMnx</w:t>
+      </w:r>
+      <w:r>
+        <w:rPr>
+          <w:lang w:val="ru-RU"/>
+        </w:rPr>
+        <w:t xml:space="preserve"> </w:t>
+      </w:r>
+      <w:r>
+        <w:rPr>
+          <w:lang w:val="ru-RU"/>
+        </w:rPr>
+        <w:t xml:space="preserve">– бібліотека для завантаження, моделювання та аналізу вуличних мереж з </w:t>
+      </w:r>
+      <w:r>
+        <w:rPr>
+          <w:lang w:val="ru-UA"/>
+        </w:rPr>
+        <w:t>OpenStreetMap</w:t>
+      </w:r>
+      <w:r>
+        <w:rPr>
+          <w:lang w:val="ru-RU"/>
+        </w:rPr>
+        <w:t>. Використовується для отримання дорожньої мережі заданого міста та її подальшої обробки;</w:t>
+      </w:r>
+    </w:p>
+    <w:p>
+      <w:pPr>
+        <w:ind w:firstLine="709"/>
+        <w:rPr>
+          <w:lang w:val="ru-RU"/>
+        </w:rPr>
+      </w:pPr>
+      <w:r>
+        <w:rPr>
+          <w:lang w:val="ru-RU"/>
+        </w:rPr>
+        <w:t>–</w:t>
+      </w:r>
+      <w:r>
+        <w:rPr>
+          <w:lang w:val="ru-RU"/>
+        </w:rPr>
+        <w:t> </w:t>
+      </w:r>
+      <w:r>
+        <w:rPr>
+          <w:lang w:val="en-US"/>
+        </w:rPr>
+        <w:t>NetworkX</w:t>
+      </w:r>
+      <w:r>
+        <w:rPr>
+          <w:lang w:val="ru-RU"/>
+        </w:rPr>
+        <w:t xml:space="preserve"> – бібліотека для роботи з графами. Застосована для обчислення найкоротших шляхів алгоритмом Дейкстри під час побудови матриці часів подорожі;</w:t>
+      </w:r>
+    </w:p>
+    <w:p>
+      <w:pPr>
+        <w:ind w:firstLine="709"/>
+        <w:rPr>
+          <w:lang w:val="ru-RU"/>
+        </w:rPr>
+      </w:pPr>
+      <w:r>
+        <w:rPr>
+          <w:lang w:val="ru-RU"/>
+        </w:rPr>
+        <w:lastRenderedPageBreak/>
+        <w:t>–</w:t>
+      </w:r>
+      <w:r>
+        <w:rPr>
+          <w:lang w:val="ru-RU"/>
+        </w:rPr>
+        <w:t> </w:t>
+      </w:r>
+      <w:r>
+        <w:rPr>
+          <w:lang w:val="en-US"/>
+        </w:rPr>
+        <w:t>GeoPy</w:t>
+      </w:r>
+      <w:r>
+        <w:rPr>
+          <w:lang w:val="ru-RU"/>
+        </w:rPr>
+        <w:t xml:space="preserve"> – клієнт до сервісу геокодування </w:t>
+      </w:r>
+      <w:r>
+        <w:rPr>
+          <w:lang w:val="en-US"/>
+        </w:rPr>
+        <w:t>Nominatim</w:t>
+      </w:r>
+      <w:r>
+        <w:rPr>
+          <w:lang w:val="ru-RU"/>
+        </w:rPr>
+        <w:t>. Перетворює адреси у пари координат (широта, довгота) та виконує зворотне геокодування;</w:t>
+      </w:r>
+    </w:p>
+    <w:p>
+      <w:pPr>
+        <w:ind w:firstLine="709"/>
+        <w:rPr>
+          <w:lang w:val="ru-RU"/>
+        </w:rPr>
+      </w:pPr>
+      <w:r>
+        <w:rPr>
+          <w:lang w:val="ru-RU"/>
+        </w:rPr>
+        <w:t>–</w:t>
+      </w:r>
+      <w:r>
+        <w:rPr>
+          <w:lang w:val="ru-RU"/>
+        </w:rPr>
+        <w:t> </w:t>
+      </w:r>
+      <w:r>
+        <w:rPr>
+          <w:lang w:val="en-US"/>
+        </w:rPr>
+        <w:t>Folium</w:t>
+      </w:r>
+      <w:r>
+        <w:rPr>
+          <w:lang w:val="ru-RU"/>
+        </w:rPr>
+        <w:t xml:space="preserve"> – генератор інтерактивних карт на базі </w:t>
+      </w:r>
+      <w:r>
+        <w:rPr>
+          <w:lang w:val="en-US"/>
+        </w:rPr>
+        <w:t>Leaflet</w:t>
+      </w:r>
+      <w:r>
+        <w:rPr>
+          <w:lang w:val="ru-RU"/>
+        </w:rPr>
+        <w:t>.</w:t>
+      </w:r>
+      <w:r>
+        <w:rPr>
+          <w:lang w:val="en-US"/>
+        </w:rPr>
+        <w:t>js</w:t>
+      </w:r>
+      <w:r>
+        <w:rPr>
+          <w:lang w:val="ru-RU"/>
+        </w:rPr>
+        <w:t xml:space="preserve"> з підтримкою анімованих маршрутів;</w:t>
+      </w:r>
+    </w:p>
+    <w:p>
+      <w:pPr>
+        <w:ind w:firstLine="709"/>
+        <w:rPr>
+          <w:lang w:val="ru-RU"/>
+        </w:rPr>
+      </w:pPr>
+      <w:r>
+        <w:rPr>
+          <w:lang w:val="ru-RU"/>
+        </w:rPr>
+        <w:t>–</w:t>
+      </w:r>
+      <w:r>
+        <w:rPr>
+          <w:lang w:val="ru-RU"/>
+        </w:rPr>
+        <w:t> </w:t>
+      </w:r>
+      <w:r>
+        <w:rPr>
+          <w:lang w:val="en-US"/>
+        </w:rPr>
+        <w:t>streamlit</w:t>
+      </w:r>
+      <w:r>
+        <w:rPr>
+          <w:lang w:val="ru-RU"/>
+        </w:rPr>
+        <w:t>-</w:t>
+      </w:r>
+      <w:r>
+        <w:rPr>
+          <w:lang w:val="en-US"/>
+        </w:rPr>
+        <w:t>folium</w:t>
+      </w:r>
+      <w:r>
+        <w:rPr>
+          <w:lang w:val="ru-RU"/>
+        </w:rPr>
+        <w:t xml:space="preserve"> – інтеграційний шар між </w:t>
+      </w:r>
+      <w:r>
+        <w:rPr>
+          <w:lang w:val="en-US"/>
+        </w:rPr>
+        <w:t>Streamlit</w:t>
+      </w:r>
+      <w:r>
+        <w:rPr>
+          <w:lang w:val="ru-RU"/>
+        </w:rPr>
+        <w:t xml:space="preserve"> і </w:t>
+      </w:r>
+      <w:r>
+        <w:rPr>
+          <w:lang w:val="en-US"/>
+        </w:rPr>
+        <w:t>Folium</w:t>
+      </w:r>
+      <w:r>
+        <w:rPr>
+          <w:lang w:val="ru-RU"/>
+        </w:rPr>
+        <w:t>;</w:t>
+      </w:r>
+    </w:p>
+    <w:p>
+      <w:pPr>
+        <w:ind w:firstLine="709"/>
+        <w:rPr>
+          <w:lang w:val="ru-RU"/>
+        </w:rPr>
+      </w:pPr>
+      <w:r>
+        <w:rPr>
+          <w:lang w:val="ru-RU"/>
+        </w:rPr>
+        <w:t>–</w:t>
+      </w:r>
+      <w:r>
+        <w:rPr>
+          <w:lang w:val="ru-RU"/>
+        </w:rPr>
+        <w:t> </w:t>
+      </w:r>
+      <w:r>
+        <w:rPr>
+          <w:lang w:val="en-US"/>
+        </w:rPr>
+        <w:t>NumPy</w:t>
+      </w:r>
+      <w:r>
+        <w:rPr>
+          <w:lang w:val="ru-RU"/>
+        </w:rPr>
+        <w:t xml:space="preserve"> </w:t>
+      </w:r>
+      <w:r>
+        <w:rPr>
+          <w:lang w:val="ru-RU"/>
+        </w:rPr>
+        <w:t>– бібліотека векторних обчислень, використовується у генетичному алгоритмі для роботи з масивами хромосом;</w:t>
+      </w:r>
+    </w:p>
+    <w:p>
+      <w:pPr>
+        <w:ind w:firstLine="709"/>
+        <w:rPr>
+          <w:lang w:val="ru-RU"/>
+        </w:rPr>
+      </w:pPr>
+      <w:r>
+        <w:rPr>
+          <w:lang w:val="ru-RU"/>
+        </w:rPr>
+        <w:t>–</w:t>
+      </w:r>
+      <w:r>
+        <w:rPr>
+          <w:lang w:val="en-US"/>
+        </w:rPr>
+        <w:t> </w:t>
+      </w:r>
+      <w:r>
+        <w:rPr>
+          <w:lang w:val="en-US"/>
+        </w:rPr>
+        <w:t>scikit</w:t>
+      </w:r>
+      <w:r>
+        <w:rPr>
+          <w:lang w:val="ru-RU"/>
+        </w:rPr>
+        <w:t>-</w:t>
+      </w:r>
+      <w:r>
+        <w:rPr>
+          <w:lang w:val="en-US"/>
+        </w:rPr>
+        <w:t>learn</w:t>
+      </w:r>
+      <w:r>
+        <w:rPr>
+          <w:lang w:val="ru-RU"/>
+        </w:rPr>
+        <w:t xml:space="preserve"> – застосовується для кластеризації пунктів доставки методом </w:t>
+      </w:r>
+      <w:r>
+        <w:rPr>
+          <w:lang w:val="en-US"/>
+        </w:rPr>
+        <w:t>k</w:t>
+      </w:r>
+      <w:r>
+        <w:rPr>
+          <w:lang w:val="ru-RU"/>
+        </w:rPr>
+        <w:t>-</w:t>
+      </w:r>
+      <w:r>
+        <w:rPr>
+          <w:lang w:val="en-US"/>
+        </w:rPr>
+        <w:t>means</w:t>
+      </w:r>
+      <w:r>
+        <w:rPr>
+          <w:lang w:val="ru-RU"/>
+        </w:rPr>
+        <w:t xml:space="preserve"> на етапі початкового розподілу замовлень між машинами;</w:t>
+      </w:r>
+    </w:p>
+    <w:p>
+      <w:pPr>
+        <w:ind w:firstLine="709"/>
+        <w:rPr>
+          <w:lang w:val="ru-RU"/>
+        </w:rPr>
+      </w:pPr>
+      <w:r>
+        <w:rPr>
+          <w:lang w:val="ru-RU"/>
+        </w:rPr>
+        <w:t>–</w:t>
+      </w:r>
+      <w:r>
+        <w:rPr>
+          <w:lang w:val="ru-RU"/>
+        </w:rPr>
+        <w:t> </w:t>
+      </w:r>
+      <w:r>
+        <w:rPr>
+          <w:lang w:val="en-US"/>
+        </w:rPr>
+        <w:t>requests</w:t>
+      </w:r>
+      <w:r>
+        <w:rPr>
+          <w:lang w:val="ru-RU"/>
+        </w:rPr>
+        <w:t xml:space="preserve"> – </w:t>
+      </w:r>
+      <w:r>
+        <w:rPr>
+          <w:lang w:val="en-US"/>
+        </w:rPr>
+        <w:t>HTTP</w:t>
+      </w:r>
+      <w:r>
+        <w:rPr>
+          <w:lang w:val="ru-RU"/>
+        </w:rPr>
+        <w:t xml:space="preserve">-клієнт для звернень до зовнішніх </w:t>
+      </w:r>
+      <w:r>
+        <w:rPr>
+          <w:lang w:val="en-US"/>
+        </w:rPr>
+        <w:t>REST</w:t>
+      </w:r>
+      <w:r>
+        <w:rPr>
+          <w:lang w:val="ru-RU"/>
+        </w:rPr>
+        <w:t xml:space="preserve"> </w:t>
+      </w:r>
+      <w:r>
+        <w:rPr>
+          <w:lang w:val="en-US"/>
+        </w:rPr>
+        <w:t>API</w:t>
+      </w:r>
+      <w:r>
+        <w:rPr>
+          <w:lang w:val="ru-RU"/>
+        </w:rPr>
+        <w:t>.</w:t>
+      </w:r>
+    </w:p>
+    <w:p>
+      <w:pPr>
+        <w:ind w:firstLine="709"/>
+        <w:rPr>
+          <w:lang w:val="ru-RU"/>
+        </w:rPr>
+      </w:pPr>
+      <w:r>
+        <w:rPr>
+          <w:lang w:val="ru-RU"/>
+        </w:rPr>
+        <w:t xml:space="preserve">Зберігання інформації про замовлення реалізовано на вбудованій у </w:t>
+      </w:r>
+      <w:r>
+        <w:rPr>
+          <w:lang w:val="en-US"/>
+        </w:rPr>
+        <w:t>Python</w:t>
+      </w:r>
+      <w:r>
+        <w:rPr>
+          <w:lang w:val="ru-RU"/>
+        </w:rPr>
+        <w:t xml:space="preserve"> СКБД </w:t>
+      </w:r>
+      <w:r>
+        <w:rPr>
+          <w:lang w:val="en-US"/>
+        </w:rPr>
+        <w:t>SQLite</w:t>
+      </w:r>
+      <w:r>
+        <w:rPr>
+          <w:lang w:val="ru-RU"/>
+        </w:rPr>
+        <w:t>, що не потребує додаткового сервера.</w:t>
+      </w:r>
+    </w:p>
+    <w:p>
+      <w:pPr>
+        <w:ind w:firstLine="709"/>
+        <w:rPr>
+          <w:lang w:val="ru-RU"/>
+        </w:rPr>
+      </w:pPr>
+      <w:r>
+        <w:rPr>
+          <w:lang w:val="ru-RU"/>
+        </w:rPr>
+        <w:t>Логіка взаємодії модулів. Взаємодія компонентів системи базується на принципах, відображених у діаграмі послідовностей (див.</w:t>
+      </w:r>
+      <w:r>
+        <w:rPr>
+          <w:lang w:val="ru-RU"/>
+        </w:rPr>
+        <w:t xml:space="preserve"> </w:t>
+      </w:r>
+      <w:r>
+        <w:t>р</w:t>
+      </w:r>
+      <w:r>
+        <w:rPr>
+          <w:lang w:val="ru-RU"/>
+        </w:rPr>
+        <w:t>исунки</w:t>
+      </w:r>
+      <w:r>
+        <w:rPr>
+          <w:lang w:val="en-US"/>
+        </w:rPr>
+        <w:t> </w:t>
+      </w:r>
+      <w:r>
+        <w:rPr>
+          <w:lang w:val="ru-RU"/>
+        </w:rPr>
+        <w:t>2.2</w:t>
+      </w:r>
+      <w:r>
+        <w:rPr>
+          <w:lang w:val="en-US"/>
+        </w:rPr>
+        <w:t> </w:t>
+      </w:r>
+      <w:r>
+        <w:rPr>
+          <w:lang w:val="ru-RU"/>
+        </w:rPr>
+        <w:t>та</w:t>
+      </w:r>
+      <w:r>
+        <w:rPr>
+          <w:lang w:val="en-US"/>
+        </w:rPr>
+        <w:t> </w:t>
+      </w:r>
+      <w:r>
+        <w:rPr>
+          <w:lang w:val="ru-RU"/>
+        </w:rPr>
+        <w:t>2.3). Процес роботи програми поділяється на наступні етапи:</w:t>
+      </w:r>
+    </w:p>
+    <w:p>
+      <w:pPr>
+        <w:ind w:firstLine="709"/>
+        <w:rPr>
+          <w:lang w:val="en-US"/>
+        </w:rPr>
+      </w:pPr>
+      <w:r>
+        <w:rPr>
+          <w:lang w:val="ru-RU"/>
+        </w:rPr>
+        <w:t xml:space="preserve">– </w:t>
+      </w:r>
+      <w:r>
+        <w:rPr>
+          <w:lang w:val="ru-RU"/>
+        </w:rPr>
+        <w:t>Підготовка даних: користувач вводить адреси через інтерфейс App, які згодом геокодуються сервісом Nominatim</w:t>
+      </w:r>
+      <w:r>
+        <w:rPr>
+          <w:lang w:val="en-US"/>
+        </w:rPr>
+        <w:t>;</w:t>
+      </w:r>
+    </w:p>
+    <w:p>
+      <w:pPr>
+        <w:ind w:firstLine="709"/>
+      </w:pPr>
+      <w:r>
+        <w:rPr>
+          <w:lang w:val="ru-RU"/>
+        </w:rPr>
+        <w:t xml:space="preserve">– </w:t>
+      </w:r>
+      <w:r>
+        <w:rPr>
+          <w:lang w:val="ru-RU"/>
+        </w:rPr>
+        <w:t>Побудова графа: GraphBuilder формує локальну модель мережі навколо депо та прив’язує точки доставки до найближчих вузлів</w:t>
+      </w:r>
+      <w:r>
+        <w:rPr>
+          <w:lang w:val="en-US"/>
+        </w:rPr>
+        <w:t>;</w:t>
+      </w:r>
+    </w:p>
+    <w:p>
+      <w:pPr>
+        <w:ind w:firstLine="709"/>
+        <w:rPr>
+          <w:lang w:val="en-US"/>
+        </w:rPr>
+      </w:pPr>
+      <w:r>
+        <w:rPr>
+          <w:lang w:val="ru-RU"/>
+        </w:rPr>
+        <w:t xml:space="preserve">– </w:t>
+      </w:r>
+      <w:r>
+        <w:rPr>
+          <w:lang w:val="ru-RU"/>
+        </w:rPr>
+        <w:t>Оптимізація: VRPSolver отримує параметри автопарку та замовлень, виконуючи еволюційний пошук наближеного до оптимального розв’язку NP-складної задачі VRPTW</w:t>
+      </w:r>
+      <w:r>
+        <w:rPr>
+          <w:lang w:val="en-US"/>
+        </w:rPr>
+        <w:t>;</w:t>
+      </w:r>
+    </w:p>
+    <w:p>
+      <w:pPr>
+        <w:ind w:firstLine="709"/>
+        <w:rPr>
+          <w:lang w:val="en-US"/>
+        </w:rPr>
+      </w:pPr>
+      <w:r>
+        <w:rPr>
+          <w:lang w:val="en-US"/>
+        </w:rPr>
+        <w:t xml:space="preserve">– </w:t>
+      </w:r>
+      <w:r>
+        <w:rPr>
+          <w:lang w:val="ru-RU"/>
+        </w:rPr>
+        <w:t xml:space="preserve">Візуалізація: результати у вигляді сформованих маршрутів передаються модулю візуалізації для рендерингу на інтерактивній </w:t>
+      </w:r>
+      <w:r>
+        <w:t>мапі</w:t>
+      </w:r>
+      <w:r>
+        <w:rPr>
+          <w:lang w:val="en-US"/>
+        </w:rPr>
+        <w:t>.</w:t>
+      </w:r>
+    </w:p>
+    <w:p>
+      <w:pPr>
+        <w:ind w:firstLine="709"/>
+      </w:pPr>
+    </w:p>
+    <w:p>
+      <w:pPr>
+        <w:ind w:firstLine="709"/>
+      </w:pPr>
+    </w:p>
+    <w:p>
+      <w:pPr>
+        <w:pStyle w:val="Heading2"/>
+        <w:rPr>
+          <w:lang w:val="ru-RU"/>
+        </w:rPr>
+      </w:pPr>
+      <w:r>
+        <w:rPr>
+          <w:lang w:val="ru-RU"/>
+        </w:rPr>
+        <w:lastRenderedPageBreak/>
+        <w:t>3.</w:t>
+      </w:r>
+      <w:r>
+        <w:rPr>
+          <w:lang w:val="ru-RU"/>
+        </w:rPr>
+        <w:t>3</w:t>
+      </w:r>
+      <w:r>
+        <w:rPr>
+          <w:lang w:val="ru-RU"/>
+        </w:rPr>
+        <w:t xml:space="preserve"> </w:t>
+      </w:r>
+      <w:r>
+        <w:t>Етапи проектування та виконання</w:t>
+      </w:r>
+    </w:p>
+    <w:p>
+      <w:pPr>
+        <w:ind w:firstLine="709"/>
+        <w:rPr>
+          <w:lang w:val="ru-RU"/>
+        </w:rPr>
+      </w:pPr>
+    </w:p>
+    <w:p>
+      <w:pPr>
+        <w:ind w:firstLine="709"/>
+        <w:rPr>
+          <w:lang w:val="ru-RU"/>
+        </w:rPr>
+      </w:pPr>
+    </w:p>
+    <w:p>
+      <w:pPr>
+        <w:ind w:firstLine="709"/>
+        <w:rPr>
+          <w:lang w:val="ru-RU"/>
+        </w:rPr>
+      </w:pPr>
+      <w:r>
+        <w:rPr>
+          <w:lang w:val="ru-RU"/>
+        </w:rPr>
+        <w:t>Розробка системи виконувалася ітеративно за наступним планом:</w:t>
+      </w:r>
+    </w:p>
+    <w:p>
+      <w:pPr>
+        <w:ind w:firstLine="709"/>
+        <w:rPr>
+          <w:lang w:val="ru-RU"/>
+        </w:rPr>
+      </w:pPr>
+      <w:r>
+        <w:rPr>
+          <w:lang w:val="ru-RU"/>
+        </w:rPr>
+        <w:t>1)</w:t>
+      </w:r>
+      <w:r>
+        <w:rPr>
+          <w:lang w:val="en-US"/>
+        </w:rPr>
+        <w:t> </w:t>
+      </w:r>
+      <w:r>
+        <w:rPr>
+          <w:lang w:val="ru-RU"/>
+        </w:rPr>
+        <w:t>Аналіз вимог. Сформульовано бізнес-задачу автоматизованого планування маршрутів доставки. Визначено функціональні вимоги: завантаження дорожньої мережі, ведення бази замовлень, побудова оптимальних маршрутів, візуалізація результатів.</w:t>
+      </w:r>
+    </w:p>
+    <w:p>
+      <w:pPr>
+        <w:ind w:firstLine="709"/>
+        <w:rPr>
+          <w:lang w:val="ru-RU"/>
+        </w:rPr>
+      </w:pPr>
+      <w:r>
+        <w:rPr>
+          <w:lang w:val="ru-RU"/>
+        </w:rPr>
+        <w:t>2)</w:t>
+      </w:r>
+      <w:r>
+        <w:rPr>
+          <w:lang w:val="en-US"/>
+        </w:rPr>
+        <w:t> </w:t>
+      </w:r>
+      <w:r>
+        <w:rPr>
+          <w:lang w:val="ru-RU"/>
+        </w:rPr>
+        <w:t>Проектування архітектури. Здійснено декомпозицію системи на сім модулів з чітко визначеним інтерфейсом між ними.</w:t>
+      </w:r>
+    </w:p>
+    <w:p>
+      <w:pPr>
+        <w:ind w:firstLine="709"/>
+        <w:rPr>
+          <w:lang w:val="ru-RU"/>
+        </w:rPr>
+      </w:pPr>
+      <w:r>
+        <w:rPr>
+          <w:lang w:val="ru-RU"/>
+        </w:rPr>
+        <w:t>3)</w:t>
+      </w:r>
+      <w:r>
+        <w:rPr>
+          <w:lang w:val="en-US"/>
+        </w:rPr>
+        <w:t> </w:t>
+      </w:r>
+      <w:r>
+        <w:rPr>
+          <w:lang w:val="ru-RU"/>
+        </w:rPr>
+        <w:t xml:space="preserve">Розробка модуля побудови графа. Реалізовано функції завантаження мережі з </w:t>
+      </w:r>
+      <w:r>
+        <w:rPr>
+          <w:lang w:val="en-US"/>
+        </w:rPr>
+        <w:t>OpenStreetMap</w:t>
+      </w:r>
+      <w:r>
+        <w:rPr>
+          <w:lang w:val="ru-RU"/>
+        </w:rPr>
+        <w:t>, обрізки до найбільшої сильнозв’язної компоненти та обчислення часів подорожі для трьох режимів пересування — авто, велосипед, пішки.</w:t>
+      </w:r>
+    </w:p>
+    <w:p>
+      <w:pPr>
+        <w:ind w:firstLine="709"/>
+        <w:rPr>
+          <w:lang w:val="ru-RU"/>
+        </w:rPr>
+      </w:pPr>
+      <w:r>
+        <w:rPr>
+          <w:lang w:val="ru-RU"/>
+        </w:rPr>
+        <w:t>4)</w:t>
+      </w:r>
+      <w:r>
+        <w:rPr>
+          <w:lang w:val="en-US"/>
+        </w:rPr>
+        <w:t> </w:t>
+      </w:r>
+      <w:r>
+        <w:rPr>
+          <w:lang w:val="ru-RU"/>
+        </w:rPr>
+        <w:t xml:space="preserve">Розробка модуля розв’язання </w:t>
+      </w:r>
+      <w:r>
+        <w:rPr>
+          <w:lang w:val="en-US"/>
+        </w:rPr>
+        <w:t>TSP</w:t>
+      </w:r>
+      <w:r>
+        <w:rPr>
+          <w:lang w:val="ru-RU"/>
+        </w:rPr>
+        <w:t>. Реалізовано чотири методи: «найближчий сусід», 2-</w:t>
+      </w:r>
+      <w:r>
+        <w:rPr>
+          <w:lang w:val="en-US"/>
+        </w:rPr>
+        <w:t>opt</w:t>
+      </w:r>
+      <w:r>
+        <w:rPr>
+          <w:lang w:val="ru-RU"/>
+        </w:rPr>
+        <w:t>, генетичний алгоритм та евристика Крістофідеса. Додано автоматичний вибір методу залежно від кількості пунктів</w:t>
+      </w:r>
+      <w:r>
+        <w:rPr>
+          <w:lang w:val="ru-RU"/>
+        </w:rPr>
+        <w:t xml:space="preserve"> </w:t>
+      </w:r>
+      <w:r>
+        <w:rPr>
+          <w:lang w:val="ru-UA"/>
+        </w:rPr>
+        <w:t>доставки</w:t>
+      </w:r>
+      <w:r>
+        <w:rPr>
+          <w:lang w:val="ru-RU"/>
+        </w:rPr>
+        <w:t>.</w:t>
+      </w:r>
+    </w:p>
+    <w:p>
+      <w:pPr>
+        <w:ind w:firstLine="709"/>
+        <w:rPr>
+          <w:lang w:val="ru-RU"/>
+        </w:rPr>
+      </w:pPr>
+      <w:r>
+        <w:rPr>
+          <w:lang w:val="ru-RU"/>
+        </w:rPr>
+        <w:t>5) </w:t>
+      </w:r>
+      <w:r>
+        <w:rPr>
+          <w:lang w:val="ru-RU"/>
+        </w:rPr>
+        <w:t xml:space="preserve">Розробка модуля розв’язання </w:t>
+      </w:r>
+      <w:r>
+        <w:rPr>
+          <w:lang w:val="en-US"/>
+        </w:rPr>
+        <w:t>VRP</w:t>
+      </w:r>
+      <w:r>
+        <w:rPr>
+          <w:lang w:val="ru-RU"/>
+        </w:rPr>
+        <w:t xml:space="preserve">. Реалізовано двофазний декодер </w:t>
+      </w:r>
+      <w:r>
+        <w:rPr>
+          <w:lang w:val="en-US"/>
+        </w:rPr>
+        <w:t>CVRPTW</w:t>
+      </w:r>
+      <w:r>
+        <w:rPr>
+          <w:lang w:val="ru-RU"/>
+        </w:rPr>
+        <w:t xml:space="preserve">: фаза 1 </w:t>
+      </w:r>
+      <w:r>
+        <w:rPr>
+          <w:lang w:val="ru-RU"/>
+        </w:rPr>
+        <w:t>–</w:t>
+      </w:r>
+      <w:r>
+        <w:rPr>
+          <w:lang w:val="ru-RU"/>
+        </w:rPr>
+        <w:t xml:space="preserve"> призначення замовлень транспортним засобам з урахуванням модальної сумісності та вантажомісткості; фаза 2 </w:t>
+      </w:r>
+      <w:r>
+        <w:rPr>
+          <w:lang w:val="ru-RU"/>
+        </w:rPr>
+        <w:t>–</w:t>
+      </w:r>
+      <w:r>
+        <w:rPr>
+          <w:lang w:val="ru-RU"/>
+        </w:rPr>
+        <w:t xml:space="preserve"> незалежний </w:t>
+      </w:r>
+      <w:r>
+        <w:rPr>
+          <w:lang w:val="en-US"/>
+        </w:rPr>
+        <w:t>TSP</w:t>
+      </w:r>
+      <w:r>
+        <w:rPr>
+          <w:lang w:val="ru-RU"/>
+        </w:rPr>
+        <w:t>-генетичний алгоритм для кожної групи.</w:t>
+      </w:r>
+    </w:p>
+    <w:p>
+      <w:pPr>
+        <w:ind w:firstLine="709"/>
+        <w:rPr>
+          <w:lang w:val="en-US"/>
+        </w:rPr>
+      </w:pPr>
+      <w:r>
+        <w:rPr>
+          <w:lang w:val="ru-RU"/>
+        </w:rPr>
+        <w:t>6) </w:t>
+      </w:r>
+      <w:r>
+        <w:rPr>
+          <w:lang w:val="ru-RU"/>
+        </w:rPr>
+        <w:t xml:space="preserve">Розробка модуля бази даних. Реалізовано клас </w:t>
+      </w:r>
+      <w:r>
+        <w:rPr>
+          <w:lang w:val="en-US"/>
+        </w:rPr>
+        <w:t>PackageDB</w:t>
+      </w:r>
+      <w:r>
+        <w:rPr>
+          <w:lang w:val="ru-RU"/>
+        </w:rPr>
+        <w:t xml:space="preserve"> на основі </w:t>
+      </w:r>
+      <w:r>
+        <w:rPr>
+          <w:lang w:val="en-US"/>
+        </w:rPr>
+        <w:t>SQLite</w:t>
+      </w:r>
+      <w:r>
+        <w:rPr>
+          <w:lang w:val="ru-RU"/>
+        </w:rPr>
+        <w:t xml:space="preserve"> з підтримкою життєвого циклу замовлення.</w:t>
+      </w:r>
+    </w:p>
+    <w:p>
+      <w:pPr>
+        <w:ind w:firstLine="709"/>
+        <w:rPr>
+          <w:lang w:val="en-US"/>
+        </w:rPr>
+      </w:pPr>
+      <w:r>
+        <w:rPr>
+          <w:lang w:val="en-US"/>
+        </w:rPr>
+        <w:t>7) </w:t>
+      </w:r>
+      <w:r>
+        <w:rPr>
+          <w:lang w:val="en-US"/>
+        </w:rPr>
+        <w:t>Розробка модуля візуалізації. Реалізовано побудову інтерактивної карти на базі Folium з анімованим відображенням маршрутів за допомогою плагіну AntPath.</w:t>
+      </w:r>
+    </w:p>
+    <w:p>
+      <w:pPr>
+        <w:ind w:firstLine="709"/>
+      </w:pPr>
+      <w:r>
+        <w:rPr>
+          <w:lang w:val="en-US"/>
+        </w:rPr>
+        <w:lastRenderedPageBreak/>
+        <w:t>8) </w:t>
+      </w:r>
+      <w:r>
+        <w:rPr>
+          <w:lang w:val="en-US"/>
+        </w:rPr>
+        <w:t>Створено інтерфейс Streamlit</w:t>
+      </w:r>
+      <w:r>
+        <w:t xml:space="preserve"> з 3 вкладками</w:t>
+      </w:r>
+      <w:r>
+        <w:rPr>
+          <w:lang w:val="en-US"/>
+        </w:rPr>
+        <w:t>: «</w:t>
+      </w:r>
+      <w:r>
+        <w:t>Оптимізація</w:t>
+      </w:r>
+      <w:r>
+        <w:rPr>
+          <w:lang w:val="en-US"/>
+        </w:rPr>
+        <w:t>», «Менеджер пакетів», «Налаштування автопарку».</w:t>
+      </w:r>
+    </w:p>
+    <w:p>
+      <w:pPr>
+        <w:ind w:firstLine="709"/>
+        <w:rPr>
+          <w:lang w:val="ru-RU"/>
+        </w:rPr>
+      </w:pPr>
+      <w:r>
+        <w:t>9) </w:t>
+      </w:r>
+      <w:r>
+        <w:rPr>
+          <w:lang w:val="ru-RU"/>
+        </w:rPr>
+        <w:t>Тестування та налагодження. Проведено функціональне тестування на реальних даних по місту Дніпро та виправлено виявлені дефекти.</w:t>
+      </w:r>
+    </w:p>
+    <w:p>
+      <w:pPr>
+        <w:ind w:firstLine="709"/>
+      </w:pPr>
+    </w:p>
+    <w:p>
+      <w:pPr>
+        <w:ind w:firstLine="709"/>
+      </w:pPr>
+    </w:p>
+    <w:p>
+      <w:pPr>
+        <w:pStyle w:val="Heading2"/>
+      </w:pPr>
+      <w:r>
+        <w:t>3.</w:t>
+      </w:r>
+      <w:r>
+        <w:rPr>
+          <w:lang w:val="en-US"/>
+        </w:rPr>
+        <w:t>4</w:t>
+      </w:r>
+      <w:r>
+        <w:t xml:space="preserve"> </w:t>
+      </w:r>
+      <w:r>
+        <w:rPr>
+          <w:lang w:val="en-US"/>
+        </w:rPr>
+        <w:t>Інструкція користувача</w:t>
+      </w:r>
+    </w:p>
+    <w:p>
+      <w:pPr>
+        <w:ind w:firstLine="709"/>
+      </w:pPr>
+    </w:p>
+    <w:p>
+      <w:pPr>
+        <w:ind w:firstLine="709"/>
+      </w:pPr>
+    </w:p>
+    <w:p>
+      <w:pPr>
         <w:pStyle w:val="Heading1"/>
         <w:pageBreakBefore/>
       </w:pPr>
@@ -7927,25 +11018,7 @@
           <w:szCs w:val="28"/>
           <w:lang w:val="en-US"/>
         </w:rPr>
-        <w:t xml:space="preserve">Miller C. E., Tucker A. W., </w:t>
-      </w:r>
-      <w:proofErr w:type="spellStart"/>
-      <w:r>
-        <w:rPr>
-          <w:sz w:val="28"/>
-          <w:szCs w:val="28"/>
-          <w:lang w:val="en-US"/>
-        </w:rPr>
-        <w:t>Zemlin</w:t>
-      </w:r>
-      <w:proofErr w:type="spellEnd"/>
-      <w:r>
-        <w:rPr>
-          <w:sz w:val="28"/>
-          <w:szCs w:val="28"/>
-          <w:lang w:val="en-US"/>
-        </w:rPr>
-        <w:t xml:space="preserve"> R. A. Integer Programming Formulations and Traveling Salesman Problems. </w:t>
+        <w:t xml:space="preserve">Miller C. E., Tucker A. W., Zemlin R. A. Integer Programming Formulations and Traveling Salesman Problems. </w:t>
       </w:r>
       <w:r>
         <w:rPr>
@@ -8087,41 +11160,13 @@
         </w:rPr>
         <w:t> </w:t>
       </w:r>
-      <w:proofErr w:type="spellStart"/>
       <w:r>
         <w:rPr>
           <w:sz w:val="28"/>
           <w:szCs w:val="28"/>
           <w:lang w:val="en-US"/>
         </w:rPr>
-        <w:t>Bräysy</w:t>
-      </w:r>
-      <w:proofErr w:type="spellEnd"/>
-      <w:r>
-        <w:rPr>
-          <w:sz w:val="28"/>
-          <w:szCs w:val="28"/>
-          <w:lang w:val="en-US"/>
-        </w:rPr>
-        <w:t xml:space="preserve"> O., </w:t>
-      </w:r>
-      <w:proofErr w:type="spellStart"/>
-      <w:r>
-        <w:rPr>
-          <w:sz w:val="28"/>
-          <w:szCs w:val="28"/>
-          <w:lang w:val="en-US"/>
-        </w:rPr>
-        <w:t>Gendreau</w:t>
-      </w:r>
-      <w:proofErr w:type="spellEnd"/>
-      <w:r>
-        <w:rPr>
-          <w:sz w:val="28"/>
-          <w:szCs w:val="28"/>
-          <w:lang w:val="en-US"/>
-        </w:rPr>
-        <w:t xml:space="preserve"> M. Vehicle Routing Problem with Time Windows, Part II: Metaheuristics. Transportation Science. 2005. Vol. 39, No. 1. P. 119–139.</w:t>
+        <w:t>Bräysy O., Gendreau M. Vehicle Routing Problem with Time Windows, Part II: Metaheuristics. Transportation Science. 2005. Vol. 39, No. 1. P. 119–139.</w:t>
       </w:r>
     </w:p>
     <w:p>
@@ -8165,25 +11210,7 @@
           <w:szCs w:val="28"/>
           <w:lang w:val="en-US"/>
         </w:rPr>
-        <w:t xml:space="preserve">Wang X., </w:t>
-      </w:r>
-      <w:proofErr w:type="spellStart"/>
-      <w:r>
-        <w:rPr>
-          <w:sz w:val="28"/>
-          <w:szCs w:val="28"/>
-          <w:lang w:val="en-US"/>
-        </w:rPr>
-        <w:t>Kopfer</w:t>
-      </w:r>
-      <w:proofErr w:type="spellEnd"/>
-      <w:r>
-        <w:rPr>
-          <w:sz w:val="28"/>
-          <w:szCs w:val="28"/>
-          <w:lang w:val="en-US"/>
-        </w:rPr>
-        <w:t xml:space="preserve"> H. Collaborative transportation planning of less-than-truckload freight. OR Spectrum. 2014. Vol. 36.</w:t>
+        <w:t>Wang X., Kopfer H. Collaborative transportation planning of less-than-truckload freight. OR Spectrum. 2014. Vol. 36.</w:t>
       </w:r>
     </w:p>
     <w:p>
@@ -8194,7 +11221,7 @@
         <w:rPr>
           <w:sz w:val="28"/>
           <w:szCs w:val="28"/>
-          <w:lang w:val="ru-RU"/>
+          <w:lang w:val="en-US"/>
         </w:rPr>
       </w:pPr>
       <w:r>
@@ -8227,25 +11254,23 @@
           <w:szCs w:val="28"/>
           <w:lang w:val="en-US"/>
         </w:rPr>
-        <w:t xml:space="preserve">Custos </w:t>
-      </w:r>
-      <w:proofErr w:type="spellStart"/>
+        <w:t xml:space="preserve">Custos Logísticos. Cargo Sapiens: </w:t>
+      </w:r>
       <w:r>
         <w:rPr>
           <w:sz w:val="28"/>
           <w:szCs w:val="28"/>
-          <w:lang w:val="en-US"/>
-        </w:rPr>
-        <w:t>Logísticos</w:t>
-      </w:r>
-      <w:proofErr w:type="spellEnd"/>
+          <w:lang w:val="ru-RU"/>
+        </w:rPr>
+        <w:t>веб</w:t>
+      </w:r>
       <w:r>
         <w:rPr>
           <w:sz w:val="28"/>
           <w:szCs w:val="28"/>
           <w:lang w:val="en-US"/>
         </w:rPr>
-        <w:t xml:space="preserve">. Cargo Sapiens: </w:t>
+        <w:t>-</w:t>
       </w:r>
       <w:r>
         <w:rPr>
@@ -8253,7 +11278,7 @@
           <w:szCs w:val="28"/>
           <w:lang w:val="ru-RU"/>
         </w:rPr>
-        <w:t>веб</w:t>
+        <w:t>сайт</w:t>
       </w:r>
       <w:r>
         <w:rPr>
@@ -8261,15 +11286,15 @@
           <w:szCs w:val="28"/>
           <w:lang w:val="en-US"/>
         </w:rPr>
-        <w:t>-</w:t>
+        <w:t xml:space="preserve">. </w:t>
       </w:r>
       <w:r>
         <w:rPr>
           <w:sz w:val="28"/>
           <w:szCs w:val="28"/>
-          <w:lang w:val="ru-RU"/>
-        </w:rPr>
-        <w:t>сайт</w:t>
+          <w:lang w:val="en-US"/>
+        </w:rPr>
+        <w:t>URL</w:t>
       </w:r>
       <w:r>
         <w:rPr>
@@ -8277,29 +11302,13 @@
           <w:szCs w:val="28"/>
           <w:lang w:val="en-US"/>
         </w:rPr>
-        <w:t xml:space="preserve">. </w:t>
+        <w:t>:</w:t>
       </w:r>
       <w:r>
         <w:rPr>
           <w:sz w:val="28"/>
           <w:szCs w:val="28"/>
           <w:lang w:val="en-US"/>
-        </w:rPr>
-        <w:t>URL</w:t>
-      </w:r>
-      <w:r>
-        <w:rPr>
-          <w:sz w:val="28"/>
-          <w:szCs w:val="28"/>
-          <w:lang w:val="ru-RU"/>
-        </w:rPr>
-        <w:t>:</w:t>
-      </w:r>
-      <w:r>
-        <w:rPr>
-          <w:sz w:val="28"/>
-          <w:szCs w:val="28"/>
-          <w:lang w:val="ru-RU"/>
         </w:rPr>
         <w:t xml:space="preserve"> </w:t>
       </w:r>
@@ -8318,11 +11327,10 @@
             <w:rStyle w:val="Hyperlink"/>
             <w:sz w:val="28"/>
             <w:szCs w:val="28"/>
-            <w:lang w:val="ru-RU"/>
+            <w:lang w:val="en-US"/>
           </w:rPr>
           <w:t>://</w:t>
         </w:r>
-        <w:proofErr w:type="spellStart"/>
         <w:r>
           <w:rPr>
             <w:rStyle w:val="Hyperlink"/>
@@ -8332,16 +11340,6 @@
           </w:rPr>
           <w:t>cargosapiens</w:t>
         </w:r>
-        <w:proofErr w:type="spellEnd"/>
-        <w:r>
-          <w:rPr>
-            <w:rStyle w:val="Hyperlink"/>
-            <w:sz w:val="28"/>
-            <w:szCs w:val="28"/>
-            <w:lang w:val="ru-RU"/>
-          </w:rPr>
-          <w:t>.</w:t>
-        </w:r>
         <w:r>
           <w:rPr>
             <w:rStyle w:val="Hyperlink"/>
@@ -8349,18 +11347,8 @@
             <w:szCs w:val="28"/>
             <w:lang w:val="en-US"/>
           </w:rPr>
-          <w:t>com</w:t>
+          <w:t>.</w:t>
         </w:r>
-        <w:r>
-          <w:rPr>
-            <w:rStyle w:val="Hyperlink"/>
-            <w:sz w:val="28"/>
-            <w:szCs w:val="28"/>
-            <w:lang w:val="ru-RU"/>
-          </w:rPr>
-          <w:t>/</w:t>
-        </w:r>
-        <w:proofErr w:type="spellStart"/>
         <w:r>
           <w:rPr>
             <w:rStyle w:val="Hyperlink"/>
@@ -8368,17 +11356,7 @@
             <w:szCs w:val="28"/>
             <w:lang w:val="en-US"/>
           </w:rPr>
-          <w:t>en</w:t>
-        </w:r>
-        <w:proofErr w:type="spellEnd"/>
-        <w:r>
-          <w:rPr>
-            <w:rStyle w:val="Hyperlink"/>
-            <w:sz w:val="28"/>
-            <w:szCs w:val="28"/>
-            <w:lang w:val="ru-RU"/>
-          </w:rPr>
-          <w:t>/</w:t>
+          <w:t>com</w:t>
         </w:r>
         <w:r>
           <w:rPr>
@@ -8387,15 +11365,6 @@
             <w:szCs w:val="28"/>
             <w:lang w:val="en-US"/>
           </w:rPr>
-          <w:t>blog</w:t>
-        </w:r>
-        <w:r>
-          <w:rPr>
-            <w:rStyle w:val="Hyperlink"/>
-            <w:sz w:val="28"/>
-            <w:szCs w:val="28"/>
-            <w:lang w:val="ru-RU"/>
-          </w:rPr>
           <w:t>/</w:t>
         </w:r>
         <w:r>
@@ -8405,18 +11374,8 @@
             <w:szCs w:val="28"/>
             <w:lang w:val="en-US"/>
           </w:rPr>
-          <w:t>custos</w:t>
+          <w:t>en</w:t>
         </w:r>
-        <w:r>
-          <w:rPr>
-            <w:rStyle w:val="Hyperlink"/>
-            <w:sz w:val="28"/>
-            <w:szCs w:val="28"/>
-            <w:lang w:val="ru-RU"/>
-          </w:rPr>
-          <w:t>-</w:t>
-        </w:r>
-        <w:proofErr w:type="spellStart"/>
         <w:r>
           <w:rPr>
             <w:rStyle w:val="Hyperlink"/>
@@ -8424,15 +11383,59 @@
             <w:szCs w:val="28"/>
             <w:lang w:val="en-US"/>
           </w:rPr>
-          <w:t>logisticos</w:t>
+          <w:t>/</w:t>
         </w:r>
-        <w:proofErr w:type="spellEnd"/>
         <w:r>
           <w:rPr>
             <w:rStyle w:val="Hyperlink"/>
             <w:sz w:val="28"/>
             <w:szCs w:val="28"/>
-            <w:lang w:val="ru-RU"/>
+            <w:lang w:val="en-US"/>
+          </w:rPr>
+          <w:t>blog</w:t>
+        </w:r>
+        <w:r>
+          <w:rPr>
+            <w:rStyle w:val="Hyperlink"/>
+            <w:sz w:val="28"/>
+            <w:szCs w:val="28"/>
+            <w:lang w:val="en-US"/>
+          </w:rPr>
+          <w:t>/</w:t>
+        </w:r>
+        <w:r>
+          <w:rPr>
+            <w:rStyle w:val="Hyperlink"/>
+            <w:sz w:val="28"/>
+            <w:szCs w:val="28"/>
+            <w:lang w:val="en-US"/>
+          </w:rPr>
+          <w:t>custos</w:t>
+        </w:r>
+        <w:r>
+          <w:rPr>
+            <w:rStyle w:val="Hyperlink"/>
+            <w:sz w:val="28"/>
+            <w:szCs w:val="28"/>
+            <w:lang w:val="en-US"/>
+          </w:rPr>
+          <w:t>-</w:t>
+        </w:r>
+        <w:r>
+          <w:rPr>
+            <w:rStyle w:val="Hyperlink"/>
+            <w:sz w:val="28"/>
+            <w:szCs w:val="28"/>
+            <w:lang w:val="en-US"/>
+          </w:rPr>
+          <w:t>logisticos</w:t>
+        </w:r>
+        <w:r>
+          <w:rPr>
+            <w:rStyle w:val="Hyperlink"/>
+            <w:sz w:val="28"/>
+            <w:szCs w:val="28"/>
+            <w:lang w:val="en-US"/>
           </w:rPr>
           <w:t>/</w:t>
         </w:r>
@@ -8441,7 +11444,7 @@
         <w:rPr>
           <w:sz w:val="28"/>
           <w:szCs w:val="28"/>
-          <w:lang w:val="ru-RU"/>
+          <w:lang w:val="en-US"/>
         </w:rPr>
         <w:t xml:space="preserve"> (</w:t>
       </w:r>
@@ -8457,7 +11460,7 @@
         <w:rPr>
           <w:sz w:val="28"/>
           <w:szCs w:val="28"/>
-          <w:lang w:val="ru-RU"/>
+          <w:lang w:val="en-US"/>
         </w:rPr>
         <w:t xml:space="preserve"> </w:t>
       </w:r>
@@ -8473,7 +11476,7 @@
         <w:rPr>
           <w:sz w:val="28"/>
           <w:szCs w:val="28"/>
-          <w:lang w:val="ru-RU"/>
+          <w:lang w:val="en-US"/>
         </w:rPr>
         <w:t>: 05.05.2026).</w:t>
       </w:r>
@@ -8872,6 +11875,119 @@
       </w:rPr>
     </w:lvl>
   </w:abstractNum>
+  <w:abstractNum w:abstractNumId="3" w15:restartNumberingAfterBreak="0">
+    <w:nsid w:val="77497141"/>
+    <w:multiLevelType w:val="hybridMultilevel"/>
+    <w:tmpl w:val="604CA01C"/>
+    <w:lvl w:ilvl="0" w:tplc="7E529F44">
+      <w:start w:val="3"/>
+      <w:numFmt w:val="bullet"/>
+      <w:lvlText w:val=""/>
+      <w:lvlJc w:val="left"/>
+      <w:pPr>
+        <w:ind w:left="1069" w:hanging="360"/>
+      </w:pPr>
+      <w:rPr>
+        <w:rFonts w:ascii="Wingdings" w:eastAsia="Calibri" w:hAnsi="Wingdings" w:cs="Tahoma" w:hint="default"/>
+      </w:rPr>
+    </w:lvl>
+    <w:lvl w:ilvl="1" w:tplc="04090003" w:tentative="1">
+      <w:start w:val="1"/>
+      <w:numFmt w:val="bullet"/>
+      <w:lvlText w:val="o"/>
+      <w:lvlJc w:val="left"/>
+      <w:pPr>
+        <w:ind w:left="1789" w:hanging="360"/>
+      </w:pPr>
+      <w:rPr>
+        <w:rFonts w:ascii="Courier New" w:hAnsi="Courier New" w:cs="Courier New" w:hint="default"/>
+      </w:rPr>
+    </w:lvl>
+    <w:lvl w:ilvl="2" w:tplc="04090005" w:tentative="1">
+      <w:start w:val="1"/>
+      <w:numFmt w:val="bullet"/>
+      <w:lvlText w:val=""/>
+      <w:lvlJc w:val="left"/>
+      <w:pPr>
+        <w:ind w:left="2509" w:hanging="360"/>
+      </w:pPr>
+      <w:rPr>
+        <w:rFonts w:ascii="Wingdings" w:hAnsi="Wingdings" w:hint="default"/>
+      </w:rPr>
+    </w:lvl>
+    <w:lvl w:ilvl="3" w:tplc="04090001" w:tentative="1">
+      <w:start w:val="1"/>
+      <w:numFmt w:val="bullet"/>
+      <w:lvlText w:val=""/>
+      <w:lvlJc w:val="left"/>
+      <w:pPr>
+        <w:ind w:left="3229" w:hanging="360"/>
+      </w:pPr>
+      <w:rPr>
+        <w:rFonts w:ascii="Symbol" w:hAnsi="Symbol" w:hint="default"/>
+      </w:rPr>
+    </w:lvl>
+    <w:lvl w:ilvl="4" w:tplc="04090003" w:tentative="1">
+      <w:start w:val="1"/>
+      <w:numFmt w:val="bullet"/>
+      <w:lvlText w:val="o"/>
+      <w:lvlJc w:val="left"/>
+      <w:pPr>
+        <w:ind w:left="3949" w:hanging="360"/>
+      </w:pPr>
+      <w:rPr>
+        <w:rFonts w:ascii="Courier New" w:hAnsi="Courier New" w:cs="Courier New" w:hint="default"/>
+      </w:rPr>
+    </w:lvl>
+    <w:lvl w:ilvl="5" w:tplc="04090005" w:tentative="1">
+      <w:start w:val="1"/>
+      <w:numFmt w:val="bullet"/>
+      <w:lvlText w:val=""/>
+      <w:lvlJc w:val="left"/>
+      <w:pPr>
+        <w:ind w:left="4669" w:hanging="360"/>
+      </w:pPr>
+      <w:rPr>
+        <w:rFonts w:ascii="Wingdings" w:hAnsi="Wingdings" w:hint="default"/>
+      </w:rPr>
+    </w:lvl>
+    <w:lvl w:ilvl="6" w:tplc="04090001" w:tentative="1">
+      <w:start w:val="1"/>
+      <w:numFmt w:val="bullet"/>
+      <w:lvlText w:val=""/>
+      <w:lvlJc w:val="left"/>
+      <w:pPr>
+        <w:ind w:left="5389" w:hanging="360"/>
+      </w:pPr>
+      <w:rPr>
+        <w:rFonts w:ascii="Symbol" w:hAnsi="Symbol" w:hint="default"/>
+      </w:rPr>
+    </w:lvl>
+    <w:lvl w:ilvl="7" w:tplc="04090003" w:tentative="1">
+      <w:start w:val="1"/>
+      <w:numFmt w:val="bullet"/>
+      <w:lvlText w:val="o"/>
+      <w:lvlJc w:val="left"/>
+      <w:pPr>
+        <w:ind w:left="6109" w:hanging="360"/>
+      </w:pPr>
+      <w:rPr>
+        <w:rFonts w:ascii="Courier New" w:hAnsi="Courier New" w:cs="Courier New" w:hint="default"/>
+      </w:rPr>
+    </w:lvl>
+    <w:lvl w:ilvl="8" w:tplc="04090005" w:tentative="1">
+      <w:start w:val="1"/>
+      <w:numFmt w:val="bullet"/>
+      <w:lvlText w:val=""/>
+      <w:lvlJc w:val="left"/>
+      <w:pPr>
+        <w:ind w:left="6829" w:hanging="360"/>
+      </w:pPr>
+      <w:rPr>
+        <w:rFonts w:ascii="Wingdings" w:hAnsi="Wingdings" w:hint="default"/>
+      </w:rPr>
+    </w:lvl>
+  </w:abstractNum>
   <w:num w:numId="1" w16cid:durableId="1406797764">
     <w:abstractNumId w:val="1"/>
   </w:num>
@@ -8880,6 +11996,9 @@
   </w:num>
   <w:num w:numId="3" w16cid:durableId="1119108395">
     <w:abstractNumId w:val="0"/>
+  </w:num>
+  <w:num w:numId="4" w16cid:durableId="338315483">
+    <w:abstractNumId w:val="3"/>
   </w:num>
 </w:numbering>
 </file>
@@ -9286,13 +12405,15 @@
   <w:style w:type="paragraph" w:default="1" w:styleId="Normal">
     <w:name w:val="Normal"/>
     <w:qFormat/>
-    <w:rsid w:val="002A5C35"/>
+    <w:rsid w:val="00DA404B"/>
     <w:pPr>
-      <w:spacing w:before="120" w:after="120"/>
+      <w:spacing w:before="120" w:after="120" w:line="360" w:lineRule="auto"/>
+      <w:jc w:val="both"/>
     </w:pPr>
     <w:rPr>
       <w:rFonts w:ascii="Times New Roman" w:hAnsi="Times New Roman"/>
       <w:sz w:val="28"/>
+      <w:lang w:val="uk-UA"/>
     </w:rPr>
   </w:style>
   <w:style w:type="paragraph" w:styleId="Heading1">

</xml_diff>